<commit_message>
Rewrite CXO brief in plain language; drop infra/region noise and AI filler.
</commit_message>
<xml_diff>
--- a/docs/FinnAI_SLM_CXO_FineTuning_Brief.docx
+++ b/docs/FinnAI_SLM_CXO_FineTuning_Brief.docx
@@ -10,8 +10,8 @@
         <w:rPr>
           <w:rFonts w:ascii="Calibri" w:hAnsi="Calibri" w:eastAsia="Calibri"/>
           <w:b/>
-          <w:color w:val="0F3D3E"/>
-          <w:sz w:val="56"/>
+          <w:i w:val="0"/>
+          <w:sz w:val="52"/>
         </w:rPr>
         <w:t>FinnAI SLM</w:t>
       </w:r>
@@ -24,10 +24,11 @@
         <w:rPr>
           <w:rFonts w:ascii="Calibri" w:hAnsi="Calibri" w:eastAsia="Calibri"/>
           <w:b w:val="0"/>
+          <w:i w:val="0"/>
           <w:color w:val="333333"/>
-          <w:sz w:val="28"/>
+          <w:sz w:val="26"/>
         </w:rPr>
-        <w:t>How we fine-tuned an on-device finance AI — for CXOs and builders</w:t>
+        <w:t>How we taught a phone-sized model to read bank SMS</w:t>
       </w:r>
     </w:p>
     <w:p>
@@ -38,56 +39,19 @@
         <w:rPr>
           <w:rFonts w:ascii="Calibri" w:hAnsi="Calibri" w:eastAsia="Calibri"/>
           <w:b w:val="0"/>
-          <w:color w:val="555555"/>
-          <w:sz w:val="20"/>
+          <w:i w:val="0"/>
+          <w:color w:val="666666"/>
+          <w:sz w:val="18"/>
         </w:rPr>
-        <w:t>FinnDot · September 2026 · Apache 2.0</w:t>
+        <w:t>FinnDot · 2026</w:t>
         <w:br/>
-        <w:t>Model: https://huggingface.co/finndot/finnai-slm-v2</w:t>
+        <w:t>Model — huggingface.co/finndot/finnai-slm-v2</w:t>
         <w:br/>
-        <w:t>Dataset: https://huggingface.co/datasets/finndot/finnai-slm-data</w:t>
+        <w:t>Data — huggingface.co/datasets/finndot/finnai-slm-data</w:t>
         <w:br/>
-        <w:t>Code: https://github.com/arunbhatg/finnai-slm</w:t>
+        <w:t>Code — github.com/arunbhatg/finnai-slm</w:t>
       </w:r>
     </w:p>
-    <w:tbl>
-      <w:tblPr>
-        <w:tblW w:type="auto" w:w="0"/>
-        <w:tblLook w:firstColumn="1" w:firstRow="1" w:lastColumn="0" w:lastRow="0" w:noHBand="0" w:noVBand="1" w:val="04A0"/>
-      </w:tblPr>
-      <w:tblGrid>
-        <w:gridCol w:w="9792"/>
-      </w:tblGrid>
-      <w:tr>
-        <w:tc>
-          <w:tcPr>
-            <w:tcW w:type="dxa" w:w="9792"/>
-            <w:shd w:fill="E8F4F3"/>
-          </w:tcPr>
-          <w:p>
-            <w:r>
-              <w:rPr>
-                <w:rFonts w:ascii="Calibri" w:hAnsi="Calibri" w:eastAsia="Calibri"/>
-                <w:b/>
-                <w:color w:val="0F3D3E"/>
-                <w:sz w:val="22"/>
-              </w:rPr>
-              <w:t>How to read this brief</w:t>
-            </w:r>
-          </w:p>
-          <w:p>
-            <w:r>
-              <w:rPr>
-                <w:rFonts w:ascii="Calibri" w:hAnsi="Calibri" w:eastAsia="Calibri"/>
-                <w:b w:val="0"/>
-                <w:sz w:val="20"/>
-              </w:rPr>
-              <w:t>Plain English sections are for CXOs and product leaders who use ChatGPT-like tools but do not train models. Technical callouts keep the real method, metrics, and trade-offs — nothing important is hidden. You can skim the teal boxes and charts first, then dive into the technical parts where needed.</w:t>
-            </w:r>
-          </w:p>
-        </w:tc>
-      </w:tr>
-    </w:tbl>
     <w:p/>
     <w:p>
       <w:pPr>
@@ -95,9 +59,9 @@
       </w:pPr>
       <w:r>
         <w:rPr>
-          <w:color w:val="0F3D3E"/>
+          <w:color w:val="1A1A1A"/>
         </w:rPr>
-        <w:t>1. Executive summary</w:t>
+        <w:t>In short</w:t>
       </w:r>
     </w:p>
     <w:p>
@@ -108,9 +72,10 @@
         <w:rPr>
           <w:rFonts w:ascii="Calibri" w:hAnsi="Calibri" w:eastAsia="Calibri"/>
           <w:b w:val="0"/>
+          <w:i w:val="0"/>
           <w:sz w:val="22"/>
         </w:rPr>
-        <w:t>FinnDot automatically turns Indian bank SMS into expense records and answers money questions. Regex parsers already cover 35+ banks. The remaining hard cases — unknown banks, Hindi/Hinglish SMS, and finance coaching — need language understanding.</w:t>
+        <w:t>FinnDot reads bank SMS and logs expenses. For banks we already know, we use hand-written parsers. For everything else — new formats, Hindi/Hinglish texts, and “where did my money go?” questions — we needed a small language model that runs on the phone.</w:t>
       </w:r>
     </w:p>
     <w:p>
@@ -121,50 +86,12 @@
         <w:rPr>
           <w:rFonts w:ascii="Calibri" w:hAnsi="Calibri" w:eastAsia="Calibri"/>
           <w:b w:val="0"/>
+          <w:i w:val="0"/>
           <w:sz w:val="22"/>
         </w:rPr>
-        <w:t>We fine-tuned a small open-source model (Qwen3, 1.7 billion parameters) so it runs on the user's phone. After training, SMS field accuracy rose from ~28% (base model) to ~98% (FinnAI v2) on a held-out test set. Training data is synthetic — no real user SMS. Total project GPU + data cost was on the order of tens of dollars, not millions.</w:t>
+        <w:t>We started from an open model (Qwen3, 1.7B parameters) and fine-tuned it on synthetic data only. No real user SMS. On a held-out test, full-field SMS accuracy went from about 28% (untuned) to about 98% (FinnAI v2).</w:t>
       </w:r>
     </w:p>
-    <w:tbl>
-      <w:tblPr>
-        <w:tblW w:type="auto" w:w="0"/>
-        <w:tblLook w:firstColumn="1" w:firstRow="1" w:lastColumn="0" w:lastRow="0" w:noHBand="0" w:noVBand="1" w:val="04A0"/>
-      </w:tblPr>
-      <w:tblGrid>
-        <w:gridCol w:w="9792"/>
-      </w:tblGrid>
-      <w:tr>
-        <w:tc>
-          <w:tcPr>
-            <w:tcW w:type="dxa" w:w="9792"/>
-            <w:shd w:fill="E8F4F3"/>
-          </w:tcPr>
-          <w:p>
-            <w:r>
-              <w:rPr>
-                <w:rFonts w:ascii="Calibri" w:hAnsi="Calibri" w:eastAsia="Calibri"/>
-                <w:b/>
-                <w:color w:val="0F3D3E"/>
-                <w:sz w:val="22"/>
-              </w:rPr>
-              <w:t>One-line takeaway</w:t>
-            </w:r>
-          </w:p>
-          <w:p>
-            <w:r>
-              <w:rPr>
-                <w:rFonts w:ascii="Calibri" w:hAnsi="Calibri" w:eastAsia="Calibri"/>
-                <w:b w:val="0"/>
-                <w:sz w:val="20"/>
-              </w:rPr>
-              <w:t>A narrow, privacy-critical product job does not need a giant cloud model. A carefully fine-tuned small model can beat a general phone-sized baseline and ship under Apache 2.0.</w:t>
-            </w:r>
-          </w:p>
-        </w:tc>
-      </w:tr>
-    </w:tbl>
-    <w:p/>
     <w:p>
       <w:pPr>
         <w:jc w:val="center"/>
@@ -172,7 +99,7 @@
       <w:r>
         <w:drawing>
           <wp:inline xmlns:a="http://schemas.openxmlformats.org/drawingml/2006/main" xmlns:pic="http://schemas.openxmlformats.org/drawingml/2006/picture">
-            <wp:extent cx="5669280" cy="2660550"/>
+            <wp:extent cx="5486400" cy="2542584"/>
             <wp:docPr id="1" name="Picture 1"/>
             <wp:cNvGraphicFramePr>
               <a:graphicFrameLocks noChangeAspect="1"/>
@@ -193,7 +120,7 @@
                   <pic:spPr>
                     <a:xfrm>
                       <a:off x="0" y="0"/>
-                      <a:ext cx="5669280" cy="2660550"/>
+                      <a:ext cx="5486400" cy="2542584"/>
                     </a:xfrm>
                     <a:prstGeom prst="rect"/>
                   </pic:spPr>
@@ -213,10 +140,10 @@
           <w:rFonts w:ascii="Calibri" w:hAnsi="Calibri" w:eastAsia="Calibri"/>
           <w:b w:val="0"/>
           <w:i/>
-          <w:color w:val="555555"/>
+          <w:color w:val="666666"/>
           <w:sz w:val="18"/>
         </w:rPr>
-        <w:t>Figure 1 — SMS extraction accuracy before vs after fine-tuning</w:t>
+        <w:t>Figure 1. Same test set, four models.</w:t>
       </w:r>
     </w:p>
     <w:p>
@@ -225,239 +152,9 @@
       </w:pPr>
       <w:r>
         <w:rPr>
-          <w:color w:val="0F3D3E"/>
+          <w:color w:val="1A1A1A"/>
         </w:rPr>
-        <w:t>2. Two audiences, one story</w:t>
-      </w:r>
-    </w:p>
-    <w:tbl>
-      <w:tblPr>
-        <w:tblStyle w:val="TableGrid"/>
-        <w:tblW w:type="auto" w:w="0"/>
-        <w:tblLook w:firstColumn="1" w:firstRow="1" w:lastColumn="0" w:lastRow="0" w:noHBand="0" w:noVBand="1" w:val="04A0"/>
-      </w:tblPr>
-      <w:tblGrid>
-        <w:gridCol w:w="3264"/>
-        <w:gridCol w:w="3264"/>
-        <w:gridCol w:w="3264"/>
-      </w:tblGrid>
-      <w:tr>
-        <w:tc>
-          <w:tcPr>
-            <w:tcW w:type="dxa" w:w="3264"/>
-            <w:shd w:fill="0F3D3E"/>
-          </w:tcPr>
-          <w:p>
-            <w:r/>
-            <w:r>
-              <w:rPr>
-                <w:rFonts w:ascii="Calibri" w:hAnsi="Calibri" w:eastAsia="Calibri"/>
-                <w:b/>
-                <w:color w:val="FFFFFF"/>
-                <w:sz w:val="20"/>
-              </w:rPr>
-              <w:t>If you are…</w:t>
-            </w:r>
-          </w:p>
-        </w:tc>
-        <w:tc>
-          <w:tcPr>
-            <w:tcW w:type="dxa" w:w="3264"/>
-            <w:shd w:fill="0F3D3E"/>
-          </w:tcPr>
-          <w:p>
-            <w:r/>
-            <w:r>
-              <w:rPr>
-                <w:rFonts w:ascii="Calibri" w:hAnsi="Calibri" w:eastAsia="Calibri"/>
-                <w:b/>
-                <w:color w:val="FFFFFF"/>
-                <w:sz w:val="20"/>
-              </w:rPr>
-              <w:t>Focus on…</w:t>
-            </w:r>
-          </w:p>
-        </w:tc>
-        <w:tc>
-          <w:tcPr>
-            <w:tcW w:type="dxa" w:w="3264"/>
-            <w:shd w:fill="0F3D3E"/>
-          </w:tcPr>
-          <w:p>
-            <w:r/>
-            <w:r>
-              <w:rPr>
-                <w:rFonts w:ascii="Calibri" w:hAnsi="Calibri" w:eastAsia="Calibri"/>
-                <w:b/>
-                <w:color w:val="FFFFFF"/>
-                <w:sz w:val="20"/>
-              </w:rPr>
-              <w:t>Skip / skim…</w:t>
-            </w:r>
-          </w:p>
-        </w:tc>
-      </w:tr>
-      <w:tr>
-        <w:tc>
-          <w:tcPr>
-            <w:tcW w:type="dxa" w:w="3264"/>
-          </w:tcPr>
-          <w:p>
-            <w:r/>
-            <w:r>
-              <w:rPr>
-                <w:rFonts w:ascii="Calibri" w:hAnsi="Calibri" w:eastAsia="Calibri"/>
-                <w:b w:val="0"/>
-                <w:sz w:val="20"/>
-              </w:rPr>
-              <w:t>CXO / product (LLM as a user)</w:t>
-            </w:r>
-          </w:p>
-        </w:tc>
-        <w:tc>
-          <w:tcPr>
-            <w:tcW w:type="dxa" w:w="3264"/>
-          </w:tcPr>
-          <w:p>
-            <w:r/>
-            <w:r>
-              <w:rPr>
-                <w:rFonts w:ascii="Calibri" w:hAnsi="Calibri" w:eastAsia="Calibri"/>
-                <w:b w:val="0"/>
-                <w:sz w:val="20"/>
-              </w:rPr>
-              <w:t>§1, §3, §4 charts, §8 cost, §9 open-source</w:t>
-            </w:r>
-          </w:p>
-        </w:tc>
-        <w:tc>
-          <w:tcPr>
-            <w:tcW w:type="dxa" w:w="3264"/>
-          </w:tcPr>
-          <w:p>
-            <w:r/>
-            <w:r>
-              <w:rPr>
-                <w:rFonts w:ascii="Calibri" w:hAnsi="Calibri" w:eastAsia="Calibri"/>
-                <w:b w:val="0"/>
-                <w:sz w:val="20"/>
-              </w:rPr>
-              <w:t>Hyperparameter tables</w:t>
-            </w:r>
-          </w:p>
-        </w:tc>
-      </w:tr>
-      <w:tr>
-        <w:tc>
-          <w:tcPr>
-            <w:tcW w:type="dxa" w:w="3264"/>
-          </w:tcPr>
-          <w:p>
-            <w:r/>
-            <w:r>
-              <w:rPr>
-                <w:rFonts w:ascii="Calibri" w:hAnsi="Calibri" w:eastAsia="Calibri"/>
-                <w:b w:val="0"/>
-                <w:sz w:val="20"/>
-              </w:rPr>
-              <w:t>Tech lead / ML-curious</w:t>
-            </w:r>
-          </w:p>
-        </w:tc>
-        <w:tc>
-          <w:tcPr>
-            <w:tcW w:type="dxa" w:w="3264"/>
-          </w:tcPr>
-          <w:p>
-            <w:r/>
-            <w:r>
-              <w:rPr>
-                <w:rFonts w:ascii="Calibri" w:hAnsi="Calibri" w:eastAsia="Calibri"/>
-                <w:b w:val="0"/>
-                <w:sz w:val="20"/>
-              </w:rPr>
-              <w:t>§5–§7 technical callouts + eval gates</w:t>
-            </w:r>
-          </w:p>
-        </w:tc>
-        <w:tc>
-          <w:tcPr>
-            <w:tcW w:type="dxa" w:w="3264"/>
-          </w:tcPr>
-          <w:p>
-            <w:r/>
-            <w:r>
-              <w:rPr>
-                <w:rFonts w:ascii="Calibri" w:hAnsi="Calibri" w:eastAsia="Calibri"/>
-                <w:b w:val="0"/>
-                <w:sz w:val="20"/>
-              </w:rPr>
-              <w:t>Nothing — read all</w:t>
-            </w:r>
-          </w:p>
-        </w:tc>
-      </w:tr>
-      <w:tr>
-        <w:tc>
-          <w:tcPr>
-            <w:tcW w:type="dxa" w:w="3264"/>
-          </w:tcPr>
-          <w:p>
-            <w:r/>
-            <w:r>
-              <w:rPr>
-                <w:rFonts w:ascii="Calibri" w:hAnsi="Calibri" w:eastAsia="Calibri"/>
-                <w:b w:val="0"/>
-                <w:sz w:val="20"/>
-              </w:rPr>
-              <w:t>Partner / investor</w:t>
-            </w:r>
-          </w:p>
-        </w:tc>
-        <w:tc>
-          <w:tcPr>
-            <w:tcW w:type="dxa" w:w="3264"/>
-          </w:tcPr>
-          <w:p>
-            <w:r/>
-            <w:r>
-              <w:rPr>
-                <w:rFonts w:ascii="Calibri" w:hAnsi="Calibri" w:eastAsia="Calibri"/>
-                <w:b w:val="0"/>
-                <w:sz w:val="20"/>
-              </w:rPr>
-              <w:t>§1, §4 privacy, §8 cost, HF/GitHub links</w:t>
-            </w:r>
-          </w:p>
-        </w:tc>
-        <w:tc>
-          <w:tcPr>
-            <w:tcW w:type="dxa" w:w="3264"/>
-          </w:tcPr>
-          <w:p>
-            <w:r/>
-            <w:r>
-              <w:rPr>
-                <w:rFonts w:ascii="Calibri" w:hAnsi="Calibri" w:eastAsia="Calibri"/>
-                <w:b w:val="0"/>
-                <w:sz w:val="20"/>
-              </w:rPr>
-              <w:t>AWS instance types</w:t>
-            </w:r>
-          </w:p>
-        </w:tc>
-      </w:tr>
-    </w:tbl>
-    <w:p/>
-    <w:p>
-      <w:pPr>
-        <w:pStyle w:val="Heading1"/>
-      </w:pPr>
-      <w:r>
-        <w:rPr>
-          <w:color w:val="0F3D3E"/>
-        </w:rPr>
-        <w:t>3. The business problem (plain English)</w:t>
+        <w:t>The problem we were solving</w:t>
       </w:r>
     </w:p>
     <w:p>
@@ -468,32 +165,22 @@
         <w:rPr>
           <w:rFonts w:ascii="Calibri" w:hAnsi="Calibri" w:eastAsia="Calibri"/>
           <w:b w:val="0"/>
+          <w:i w:val="0"/>
           <w:sz w:val="22"/>
         </w:rPr>
-        <w:t>Banks text customers after every UPI payment. FinnDot reads those texts and books the expense automatically. That saves users from typing. It only works if we can reliably extract: amount, merchant, type, account last-4, balance.</w:t>
+        <w:t>A bank text looks like this:</w:t>
       </w:r>
     </w:p>
     <w:p>
       <w:pPr>
-        <w:spacing w:after="160" w:before="0"/>
-      </w:pPr>
-      <w:r>
-        <w:rPr>
-          <w:rFonts w:ascii="Calibri" w:hAnsi="Calibri" w:eastAsia="Calibri"/>
-          <w:b/>
-          <w:sz w:val="22"/>
-        </w:rPr>
-        <w:t>Example SMS</w:t>
-      </w:r>
-    </w:p>
-    <w:p>
-      <w:pPr>
-        <w:spacing w:after="160" w:before="0"/>
+        <w:spacing w:after="200"/>
       </w:pPr>
       <w:r>
         <w:rPr>
           <w:rFonts w:ascii="Calibri" w:hAnsi="Calibri" w:eastAsia="Calibri"/>
           <w:b w:val="0"/>
+          <w:i/>
+          <w:color w:val="444444"/>
           <w:sz w:val="20"/>
         </w:rPr>
         <w:t>HDFC Bank: Rs.499.00 debited from A/c XX1234 to SWIGGY via UPI. Avl Bal Rs.15000.50</w:t>
@@ -506,10 +193,26 @@
       <w:r>
         <w:rPr>
           <w:rFonts w:ascii="Calibri" w:hAnsi="Calibri" w:eastAsia="Calibri"/>
-          <w:b/>
+          <w:b w:val="0"/>
+          <w:i w:val="0"/>
           <w:sz w:val="22"/>
         </w:rPr>
-        <w:t>Target machine-readable result</w:t>
+        <w:t>We need this:</w:t>
+      </w:r>
+    </w:p>
+    <w:p>
+      <w:pPr>
+        <w:spacing w:after="200"/>
+      </w:pPr>
+      <w:r>
+        <w:rPr>
+          <w:rFonts w:ascii="Calibri" w:hAnsi="Calibri" w:eastAsia="Calibri"/>
+          <w:b w:val="0"/>
+          <w:i/>
+          <w:color w:val="444444"/>
+          <w:sz w:val="20"/>
+        </w:rPr>
+        <w:t>{"amount": 499.0, "merchant": "SWIGGY", "type": "EXPENSE", "account": "1234", "balance": 15000.5}</w:t>
       </w:r>
     </w:p>
     <w:p>
@@ -520,20 +223,10 @@
         <w:rPr>
           <w:rFonts w:ascii="Calibri" w:hAnsi="Calibri" w:eastAsia="Calibri"/>
           <w:b w:val="0"/>
-          <w:sz w:val="20"/>
+          <w:i w:val="0"/>
+          <w:sz w:val="22"/>
         </w:rPr>
-        <w:t>{"amount": 499.0, "merchant": "SWIGGY", "type": "EXPENSE", "account": "1234", "balance": 15000.5, "category": "Food"}</w:t>
-      </w:r>
-    </w:p>
-    <w:p>
-      <w:pPr>
-        <w:pStyle w:val="Heading2"/>
-      </w:pPr>
-      <w:r>
-        <w:rPr>
-          <w:color w:val="0F3D3E"/>
-        </w:rPr>
-        <w:t>3.1 Why not only rules (regex)?</w:t>
+        <w:t>Rules work great when the format is known. They break when the bank changes wording, the message is in another language, or the text is an OTP and should be ignored. Coaching is not a regex problem at all.</w:t>
       </w:r>
     </w:p>
     <w:p>
@@ -544,20 +237,21 @@
         <w:rPr>
           <w:rFonts w:ascii="Calibri" w:hAnsi="Calibri" w:eastAsia="Calibri"/>
           <w:b w:val="0"/>
+          <w:i w:val="0"/>
           <w:sz w:val="22"/>
         </w:rPr>
-        <w:t>Rules are excellent for known banks — we keep them. They fail on the long tail: new banks, format changes, Indic scripts, and OTP/promo messages that must be ignored. Coaching (“Where am I overspending?”) is not a regex problem.</w:t>
+        <w:t>Cloud chat APIs could do the job, but bank SMS has balances and account fragments. We did not want that traffic leaving the device for this path. Local model, download once, run offline.</w:t>
       </w:r>
     </w:p>
     <w:p>
       <w:pPr>
-        <w:pStyle w:val="Heading2"/>
+        <w:pStyle w:val="Heading1"/>
       </w:pPr>
       <w:r>
         <w:rPr>
-          <w:color w:val="0F3D3E"/>
+          <w:color w:val="1A1A1A"/>
         </w:rPr>
-        <w:t>3.2 Why not only ChatGPT-in-the-cloud?</w:t>
+        <w:t>What “fine-tuning” means here</w:t>
       </w:r>
     </w:p>
     <w:p>
@@ -568,9 +262,24 @@
         <w:rPr>
           <w:rFonts w:ascii="Calibri" w:hAnsi="Calibri" w:eastAsia="Calibri"/>
           <w:b w:val="0"/>
+          <w:i w:val="0"/>
           <w:sz w:val="22"/>
         </w:rPr>
-        <w:t>Bank SMS contains balances and account fragments. Sending every message to a cloud API creates privacy, cost, latency, and offline gaps. FinnDot’s product promise is local-first AI when the user wants it.</w:t>
+        <w:t>If you only use ChatGPT as a product: fine-tuning is not “make a new ChatGPT.” It is taking a general model that already speaks language, and teaching it one job with many graded examples.</w:t>
+      </w:r>
+    </w:p>
+    <w:p>
+      <w:pPr>
+        <w:spacing w:after="160" w:before="0"/>
+      </w:pPr>
+      <w:r>
+        <w:rPr>
+          <w:rFonts w:ascii="Calibri" w:hAnsi="Calibri" w:eastAsia="Calibri"/>
+          <w:b w:val="0"/>
+          <w:i w:val="0"/>
+          <w:sz w:val="22"/>
+        </w:rPr>
+        <w:t>We used QLoRA — keep the big model frozen, train a thin adapter (~67 MB). Cheaper than full retraining, less chance of wiping general ability, fits on a single modern GPU.</w:t>
       </w:r>
     </w:p>
     <w:p>
@@ -580,7 +289,7 @@
       <w:r>
         <w:drawing>
           <wp:inline xmlns:a="http://schemas.openxmlformats.org/drawingml/2006/main" xmlns:pic="http://schemas.openxmlformats.org/drawingml/2006/picture">
-            <wp:extent cx="5669280" cy="3092335"/>
+            <wp:extent cx="5486400" cy="2155649"/>
             <wp:docPr id="2" name="Picture 2"/>
             <wp:cNvGraphicFramePr>
               <a:graphicFrameLocks noChangeAspect="1"/>
@@ -589,7 +298,7 @@
               <a:graphicData uri="http://schemas.openxmlformats.org/drawingml/2006/picture">
                 <pic:pic>
                   <pic:nvPicPr>
-                    <pic:cNvPr id="0" name="decision.png"/>
+                    <pic:cNvPr id="0" name="qlora.png"/>
                     <pic:cNvPicPr/>
                   </pic:nvPicPr>
                   <pic:blipFill>
@@ -601,7 +310,7 @@
                   <pic:spPr>
                     <a:xfrm>
                       <a:off x="0" y="0"/>
-                      <a:ext cx="5669280" cy="3092335"/>
+                      <a:ext cx="5486400" cy="2155649"/>
                     </a:xfrm>
                     <a:prstGeom prst="rect"/>
                   </pic:spPr>
@@ -621,69 +330,407 @@
           <w:rFonts w:ascii="Calibri" w:hAnsi="Calibri" w:eastAsia="Calibri"/>
           <w:b w:val="0"/>
           <w:i/>
-          <w:color w:val="555555"/>
+          <w:color w:val="666666"/>
           <w:sz w:val="18"/>
         </w:rPr>
-        <w:t>Figure 2 — Decision path: when on-device fine-tuning is the right bet</w:t>
+        <w:t>Figure 2. Adapter on top of a frozen base.</w:t>
       </w:r>
     </w:p>
     <w:p>
       <w:pPr>
-        <w:pStyle w:val="Heading1"/>
+        <w:pStyle w:val="Heading2"/>
       </w:pPr>
       <w:r>
         <w:rPr>
-          <w:color w:val="0F3D3E"/>
+          <w:color w:val="1A1A1A"/>
         </w:rPr>
-        <w:t>4. What “fine-tuning” means (for non-ML readers)</w:t>
-      </w:r>
-    </w:p>
-    <w:p>
-      <w:pPr>
-        <w:spacing w:after="160" w:before="0"/>
-      </w:pPr>
-      <w:r>
-        <w:rPr>
-          <w:rFonts w:ascii="Calibri" w:hAnsi="Calibri" w:eastAsia="Calibri"/>
-          <w:b w:val="0"/>
-          <w:sz w:val="22"/>
-        </w:rPr>
-        <w:t>Think of a large language model as a very well-read generalist. Fine-tuning is like sending that generalist on a short, intense apprenticeship for one job — reading Indian bank SMS and answering finance questions with numbers that appear in the user’s ledger — without rewriting everything they already know.</w:t>
+        <w:t>Settings that mattered</w:t>
       </w:r>
     </w:p>
     <w:tbl>
       <w:tblPr>
+        <w:tblStyle w:val="TableGrid"/>
         <w:tblW w:type="auto" w:w="0"/>
         <w:tblLook w:firstColumn="1" w:firstRow="1" w:lastColumn="0" w:lastRow="0" w:noHBand="0" w:noVBand="1" w:val="04A0"/>
       </w:tblPr>
       <w:tblGrid>
-        <w:gridCol w:w="9792"/>
+        <w:gridCol w:w="3216"/>
+        <w:gridCol w:w="3216"/>
+        <w:gridCol w:w="3216"/>
       </w:tblGrid>
       <w:tr>
         <w:tc>
           <w:tcPr>
-            <w:tcW w:type="dxa" w:w="9792"/>
-            <w:shd w:fill="E8F4F3"/>
+            <w:tcW w:type="dxa" w:w="3216"/>
+            <w:shd w:fill="1A1A1A"/>
           </w:tcPr>
           <w:p>
+            <w:r/>
             <w:r>
               <w:rPr>
                 <w:rFonts w:ascii="Calibri" w:hAnsi="Calibri" w:eastAsia="Calibri"/>
                 <w:b/>
-                <w:color w:val="0F3D3E"/>
-                <w:sz w:val="22"/>
+                <w:i w:val="0"/>
+                <w:color w:val="FFFFFF"/>
+                <w:sz w:val="20"/>
               </w:rPr>
-              <w:t>Analogy</w:t>
+              <w:t>Choice</w:t>
             </w:r>
           </w:p>
+        </w:tc>
+        <w:tc>
+          <w:tcPr>
+            <w:tcW w:type="dxa" w:w="3216"/>
+            <w:shd w:fill="1A1A1A"/>
+          </w:tcPr>
           <w:p>
+            <w:r/>
+            <w:r>
+              <w:rPr>
+                <w:rFonts w:ascii="Calibri" w:hAnsi="Calibri" w:eastAsia="Calibri"/>
+                <w:b/>
+                <w:i w:val="0"/>
+                <w:color w:val="FFFFFF"/>
+                <w:sz w:val="20"/>
+              </w:rPr>
+              <w:t>What we used</w:t>
+            </w:r>
+          </w:p>
+        </w:tc>
+        <w:tc>
+          <w:tcPr>
+            <w:tcW w:type="dxa" w:w="3216"/>
+            <w:shd w:fill="1A1A1A"/>
+          </w:tcPr>
+          <w:p>
+            <w:r/>
+            <w:r>
+              <w:rPr>
+                <w:rFonts w:ascii="Calibri" w:hAnsi="Calibri" w:eastAsia="Calibri"/>
+                <w:b/>
+                <w:i w:val="0"/>
+                <w:color w:val="FFFFFF"/>
+                <w:sz w:val="20"/>
+              </w:rPr>
+              <w:t>Why</w:t>
+            </w:r>
+          </w:p>
+        </w:tc>
+      </w:tr>
+      <w:tr>
+        <w:tc>
+          <w:tcPr>
+            <w:tcW w:type="dxa" w:w="3216"/>
+          </w:tcPr>
+          <w:p>
+            <w:r/>
             <w:r>
               <w:rPr>
                 <w:rFonts w:ascii="Calibri" w:hAnsi="Calibri" w:eastAsia="Calibri"/>
                 <w:b w:val="0"/>
+                <w:i w:val="0"/>
                 <w:sz w:val="20"/>
               </w:rPr>
-              <w:t>Hiring a brilliant generalist and giving them a 5-hour bootcamp with 16,000 graded examples, instead of hiring a 200-person team or calling a consultant for every SMS.</w:t>
+              <w:t>Base</w:t>
+            </w:r>
+          </w:p>
+        </w:tc>
+        <w:tc>
+          <w:tcPr>
+            <w:tcW w:type="dxa" w:w="3216"/>
+          </w:tcPr>
+          <w:p>
+            <w:r/>
+            <w:r>
+              <w:rPr>
+                <w:rFonts w:ascii="Calibri" w:hAnsi="Calibri" w:eastAsia="Calibri"/>
+                <w:b w:val="0"/>
+                <w:i w:val="0"/>
+                <w:sz w:val="20"/>
+              </w:rPr>
+              <w:t>Qwen3-1.7B</w:t>
+            </w:r>
+          </w:p>
+        </w:tc>
+        <w:tc>
+          <w:tcPr>
+            <w:tcW w:type="dxa" w:w="3216"/>
+          </w:tcPr>
+          <w:p>
+            <w:r/>
+            <w:r>
+              <w:rPr>
+                <w:rFonts w:ascii="Calibri" w:hAnsi="Calibri" w:eastAsia="Calibri"/>
+                <w:b w:val="0"/>
+                <w:i w:val="0"/>
+                <w:sz w:val="20"/>
+              </w:rPr>
+              <w:t>Open license, small enough for phones</w:t>
+            </w:r>
+          </w:p>
+        </w:tc>
+      </w:tr>
+      <w:tr>
+        <w:tc>
+          <w:tcPr>
+            <w:tcW w:type="dxa" w:w="3216"/>
+          </w:tcPr>
+          <w:p>
+            <w:r/>
+            <w:r>
+              <w:rPr>
+                <w:rFonts w:ascii="Calibri" w:hAnsi="Calibri" w:eastAsia="Calibri"/>
+                <w:b w:val="0"/>
+                <w:i w:val="0"/>
+                <w:sz w:val="20"/>
+              </w:rPr>
+              <w:t>Method</w:t>
+            </w:r>
+          </w:p>
+        </w:tc>
+        <w:tc>
+          <w:tcPr>
+            <w:tcW w:type="dxa" w:w="3216"/>
+          </w:tcPr>
+          <w:p>
+            <w:r/>
+            <w:r>
+              <w:rPr>
+                <w:rFonts w:ascii="Calibri" w:hAnsi="Calibri" w:eastAsia="Calibri"/>
+                <w:b w:val="0"/>
+                <w:i w:val="0"/>
+                <w:sz w:val="20"/>
+              </w:rPr>
+              <w:t>QLoRA SFT</w:t>
+            </w:r>
+          </w:p>
+        </w:tc>
+        <w:tc>
+          <w:tcPr>
+            <w:tcW w:type="dxa" w:w="3216"/>
+          </w:tcPr>
+          <w:p>
+            <w:r/>
+            <w:r>
+              <w:rPr>
+                <w:rFonts w:ascii="Calibri" w:hAnsi="Calibri" w:eastAsia="Calibri"/>
+                <w:b w:val="0"/>
+                <w:i w:val="0"/>
+                <w:sz w:val="20"/>
+              </w:rPr>
+              <w:t>Specialise without full retrain</w:t>
+            </w:r>
+          </w:p>
+        </w:tc>
+      </w:tr>
+      <w:tr>
+        <w:tc>
+          <w:tcPr>
+            <w:tcW w:type="dxa" w:w="3216"/>
+          </w:tcPr>
+          <w:p>
+            <w:r/>
+            <w:r>
+              <w:rPr>
+                <w:rFonts w:ascii="Calibri" w:hAnsi="Calibri" w:eastAsia="Calibri"/>
+                <w:b w:val="0"/>
+                <w:i w:val="0"/>
+                <w:sz w:val="20"/>
+              </w:rPr>
+              <w:t>LoRA rank</w:t>
+            </w:r>
+          </w:p>
+        </w:tc>
+        <w:tc>
+          <w:tcPr>
+            <w:tcW w:type="dxa" w:w="3216"/>
+          </w:tcPr>
+          <w:p>
+            <w:r/>
+            <w:r>
+              <w:rPr>
+                <w:rFonts w:ascii="Calibri" w:hAnsi="Calibri" w:eastAsia="Calibri"/>
+                <w:b w:val="0"/>
+                <w:i w:val="0"/>
+                <w:sz w:val="20"/>
+              </w:rPr>
+              <w:t>16</w:t>
+            </w:r>
+          </w:p>
+        </w:tc>
+        <w:tc>
+          <w:tcPr>
+            <w:tcW w:type="dxa" w:w="3216"/>
+          </w:tcPr>
+          <w:p>
+            <w:r/>
+            <w:r>
+              <w:rPr>
+                <w:rFonts w:ascii="Calibri" w:hAnsi="Calibri" w:eastAsia="Calibri"/>
+                <w:b w:val="0"/>
+                <w:i w:val="0"/>
+                <w:sz w:val="20"/>
+              </w:rPr>
+              <w:t>Enough for JSON style; larger did not help</w:t>
+            </w:r>
+          </w:p>
+        </w:tc>
+      </w:tr>
+      <w:tr>
+        <w:tc>
+          <w:tcPr>
+            <w:tcW w:type="dxa" w:w="3216"/>
+          </w:tcPr>
+          <w:p>
+            <w:r/>
+            <w:r>
+              <w:rPr>
+                <w:rFonts w:ascii="Calibri" w:hAnsi="Calibri" w:eastAsia="Calibri"/>
+                <w:b w:val="0"/>
+                <w:i w:val="0"/>
+                <w:sz w:val="20"/>
+              </w:rPr>
+              <w:t>Epochs</w:t>
+            </w:r>
+          </w:p>
+        </w:tc>
+        <w:tc>
+          <w:tcPr>
+            <w:tcW w:type="dxa" w:w="3216"/>
+          </w:tcPr>
+          <w:p>
+            <w:r/>
+            <w:r>
+              <w:rPr>
+                <w:rFonts w:ascii="Calibri" w:hAnsi="Calibri" w:eastAsia="Calibri"/>
+                <w:b w:val="0"/>
+                <w:i w:val="0"/>
+                <w:sz w:val="20"/>
+              </w:rPr>
+              <w:t>3</w:t>
+            </w:r>
+          </w:p>
+        </w:tc>
+        <w:tc>
+          <w:tcPr>
+            <w:tcW w:type="dxa" w:w="3216"/>
+          </w:tcPr>
+          <w:p>
+            <w:r/>
+            <w:r>
+              <w:rPr>
+                <w:rFonts w:ascii="Calibri" w:hAnsi="Calibri" w:eastAsia="Calibri"/>
+                <w:b w:val="0"/>
+                <w:i w:val="0"/>
+                <w:sz w:val="20"/>
+              </w:rPr>
+              <w:t>16k examples; more started to overfit patterns</w:t>
+            </w:r>
+          </w:p>
+        </w:tc>
+      </w:tr>
+      <w:tr>
+        <w:tc>
+          <w:tcPr>
+            <w:tcW w:type="dxa" w:w="3216"/>
+          </w:tcPr>
+          <w:p>
+            <w:r/>
+            <w:r>
+              <w:rPr>
+                <w:rFonts w:ascii="Calibri" w:hAnsi="Calibri" w:eastAsia="Calibri"/>
+                <w:b w:val="0"/>
+                <w:i w:val="0"/>
+                <w:sz w:val="20"/>
+              </w:rPr>
+              <w:t>Pick checkpoint by</w:t>
+            </w:r>
+          </w:p>
+        </w:tc>
+        <w:tc>
+          <w:tcPr>
+            <w:tcW w:type="dxa" w:w="3216"/>
+          </w:tcPr>
+          <w:p>
+            <w:r/>
+            <w:r>
+              <w:rPr>
+                <w:rFonts w:ascii="Calibri" w:hAnsi="Calibri" w:eastAsia="Calibri"/>
+                <w:b w:val="0"/>
+                <w:i w:val="0"/>
+                <w:sz w:val="20"/>
+              </w:rPr>
+              <w:t>Val SMS exact-match</w:t>
+            </w:r>
+          </w:p>
+        </w:tc>
+        <w:tc>
+          <w:tcPr>
+            <w:tcW w:type="dxa" w:w="3216"/>
+          </w:tcPr>
+          <w:p>
+            <w:r/>
+            <w:r>
+              <w:rPr>
+                <w:rFonts w:ascii="Calibri" w:hAnsi="Calibri" w:eastAsia="Calibri"/>
+                <w:b w:val="0"/>
+                <w:i w:val="0"/>
+                <w:sz w:val="20"/>
+              </w:rPr>
+              <w:t>Loss alone lied to us before</w:t>
+            </w:r>
+          </w:p>
+        </w:tc>
+      </w:tr>
+      <w:tr>
+        <w:tc>
+          <w:tcPr>
+            <w:tcW w:type="dxa" w:w="3216"/>
+          </w:tcPr>
+          <w:p>
+            <w:r/>
+            <w:r>
+              <w:rPr>
+                <w:rFonts w:ascii="Calibri" w:hAnsi="Calibri" w:eastAsia="Calibri"/>
+                <w:b w:val="0"/>
+                <w:i w:val="0"/>
+                <w:sz w:val="20"/>
+              </w:rPr>
+              <w:t>Thinking / chain-of-thought</w:t>
+            </w:r>
+          </w:p>
+        </w:tc>
+        <w:tc>
+          <w:tcPr>
+            <w:tcW w:type="dxa" w:w="3216"/>
+          </w:tcPr>
+          <w:p>
+            <w:r/>
+            <w:r>
+              <w:rPr>
+                <w:rFonts w:ascii="Calibri" w:hAnsi="Calibri" w:eastAsia="Calibri"/>
+                <w:b w:val="0"/>
+                <w:i w:val="0"/>
+                <w:sz w:val="20"/>
+              </w:rPr>
+              <w:t>Off</w:t>
+            </w:r>
+          </w:p>
+        </w:tc>
+        <w:tc>
+          <w:tcPr>
+            <w:tcW w:type="dxa" w:w="3216"/>
+          </w:tcPr>
+          <w:p>
+            <w:r/>
+            <w:r>
+              <w:rPr>
+                <w:rFonts w:ascii="Calibri" w:hAnsi="Calibri" w:eastAsia="Calibri"/>
+                <w:b w:val="0"/>
+                <w:i w:val="0"/>
+                <w:sz w:val="20"/>
+              </w:rPr>
+              <w:t>Phone needs a fast JSON answer</w:t>
             </w:r>
           </w:p>
         </w:tc>
@@ -692,12 +739,23 @@
     <w:p/>
     <w:p>
       <w:pPr>
+        <w:pStyle w:val="Heading1"/>
+      </w:pPr>
+      <w:r>
+        <w:rPr>
+          <w:color w:val="1A1A1A"/>
+        </w:rPr>
+        <w:t>Where it sits in the app</w:t>
+      </w:r>
+    </w:p>
+    <w:p>
+      <w:pPr>
         <w:jc w:val="center"/>
       </w:pPr>
       <w:r>
         <w:drawing>
           <wp:inline xmlns:a="http://schemas.openxmlformats.org/drawingml/2006/main" xmlns:pic="http://schemas.openxmlformats.org/drawingml/2006/picture">
-            <wp:extent cx="5669280" cy="2519680"/>
+            <wp:extent cx="5486400" cy="2505844"/>
             <wp:docPr id="3" name="Picture 3"/>
             <wp:cNvGraphicFramePr>
               <a:graphicFrameLocks noChangeAspect="1"/>
@@ -706,7 +764,7 @@
               <a:graphicData uri="http://schemas.openxmlformats.org/drawingml/2006/picture">
                 <pic:pic>
                   <pic:nvPicPr>
-                    <pic:cNvPr id="0" name="qlora.png"/>
+                    <pic:cNvPr id="0" name="architecture.png"/>
                     <pic:cNvPicPr/>
                   </pic:nvPicPr>
                   <pic:blipFill>
@@ -718,7 +776,7 @@
                   <pic:spPr>
                     <a:xfrm>
                       <a:off x="0" y="0"/>
-                      <a:ext cx="5669280" cy="2519680"/>
+                      <a:ext cx="5486400" cy="2505844"/>
                     </a:xfrm>
                     <a:prstGeom prst="rect"/>
                   </pic:spPr>
@@ -738,21 +796,10 @@
           <w:rFonts w:ascii="Calibri" w:hAnsi="Calibri" w:eastAsia="Calibri"/>
           <w:b w:val="0"/>
           <w:i/>
-          <w:color w:val="555555"/>
+          <w:color w:val="666666"/>
           <w:sz w:val="18"/>
         </w:rPr>
-        <w:t>Figure 3 — QLoRA: freeze the base brain, train a small specialist adapter</w:t>
-      </w:r>
-    </w:p>
-    <w:p>
-      <w:pPr>
-        <w:pStyle w:val="Heading2"/>
-      </w:pPr>
-      <w:r>
-        <w:rPr>
-          <w:color w:val="0F3D3E"/>
-        </w:rPr>
-        <w:t>4.1 Technical: QLoRA SFT (do not skip)</w:t>
+        <w:t>Figure 3. Parsers first. Model for the rest.</w:t>
       </w:r>
     </w:p>
     <w:p>
@@ -763,552 +810,21 @@
         <w:rPr>
           <w:rFonts w:ascii="Calibri" w:hAnsi="Calibri" w:eastAsia="Calibri"/>
           <w:b w:val="0"/>
+          <w:i w:val="0"/>
           <w:sz w:val="22"/>
         </w:rPr>
-        <w:t>We used Supervised Fine-Tuning (SFT) with QLoRA on Qwen/Qwen3-1.7B (Apache 2.0). The base weights are quantized to 4-bit (NF4) during training so one NVIDIA A10G (24 GB) is enough. LoRA inserts low-rank matrices (rank 16, alpha 32) into attention and MLP projections (q, k, v, o, gate, up, down). Only those matrices train.</w:t>
+        <w:t>We did not throw away the 35+ bank parsers. The model is the long-tail and the coach.</w:t>
       </w:r>
     </w:p>
-    <w:tbl>
-      <w:tblPr>
-        <w:tblStyle w:val="TableGrid"/>
-        <w:tblW w:type="auto" w:w="0"/>
-        <w:tblLook w:firstColumn="1" w:firstRow="1" w:lastColumn="0" w:lastRow="0" w:noHBand="0" w:noVBand="1" w:val="04A0"/>
-      </w:tblPr>
-      <w:tblGrid>
-        <w:gridCol w:w="3264"/>
-        <w:gridCol w:w="3264"/>
-        <w:gridCol w:w="3264"/>
-      </w:tblGrid>
-      <w:tr>
-        <w:tc>
-          <w:tcPr>
-            <w:tcW w:type="dxa" w:w="3264"/>
-            <w:shd w:fill="0F3D3E"/>
-          </w:tcPr>
-          <w:p>
-            <w:r/>
-            <w:r>
-              <w:rPr>
-                <w:rFonts w:ascii="Calibri" w:hAnsi="Calibri" w:eastAsia="Calibri"/>
-                <w:b/>
-                <w:color w:val="FFFFFF"/>
-                <w:sz w:val="20"/>
-              </w:rPr>
-              <w:t>Knob</w:t>
-            </w:r>
-          </w:p>
-        </w:tc>
-        <w:tc>
-          <w:tcPr>
-            <w:tcW w:type="dxa" w:w="3264"/>
-            <w:shd w:fill="0F3D3E"/>
-          </w:tcPr>
-          <w:p>
-            <w:r/>
-            <w:r>
-              <w:rPr>
-                <w:rFonts w:ascii="Calibri" w:hAnsi="Calibri" w:eastAsia="Calibri"/>
-                <w:b/>
-                <w:color w:val="FFFFFF"/>
-                <w:sz w:val="20"/>
-              </w:rPr>
-              <w:t>Value</w:t>
-            </w:r>
-          </w:p>
-        </w:tc>
-        <w:tc>
-          <w:tcPr>
-            <w:tcW w:type="dxa" w:w="3264"/>
-            <w:shd w:fill="0F3D3E"/>
-          </w:tcPr>
-          <w:p>
-            <w:r/>
-            <w:r>
-              <w:rPr>
-                <w:rFonts w:ascii="Calibri" w:hAnsi="Calibri" w:eastAsia="Calibri"/>
-                <w:b/>
-                <w:color w:val="FFFFFF"/>
-                <w:sz w:val="20"/>
-              </w:rPr>
-              <w:t>Why it matters</w:t>
-            </w:r>
-          </w:p>
-        </w:tc>
-      </w:tr>
-      <w:tr>
-        <w:tc>
-          <w:tcPr>
-            <w:tcW w:type="dxa" w:w="3264"/>
-          </w:tcPr>
-          <w:p>
-            <w:r/>
-            <w:r>
-              <w:rPr>
-                <w:rFonts w:ascii="Calibri" w:hAnsi="Calibri" w:eastAsia="Calibri"/>
-                <w:b w:val="0"/>
-                <w:sz w:val="20"/>
-              </w:rPr>
-              <w:t>Base model</w:t>
-            </w:r>
-          </w:p>
-        </w:tc>
-        <w:tc>
-          <w:tcPr>
-            <w:tcW w:type="dxa" w:w="3264"/>
-          </w:tcPr>
-          <w:p>
-            <w:r/>
-            <w:r>
-              <w:rPr>
-                <w:rFonts w:ascii="Calibri" w:hAnsi="Calibri" w:eastAsia="Calibri"/>
-                <w:b w:val="0"/>
-                <w:sz w:val="20"/>
-              </w:rPr>
-              <w:t>Qwen3-1.7B Instruct</w:t>
-            </w:r>
-          </w:p>
-        </w:tc>
-        <w:tc>
-          <w:tcPr>
-            <w:tcW w:type="dxa" w:w="3264"/>
-          </w:tcPr>
-          <w:p>
-            <w:r/>
-            <w:r>
-              <w:rPr>
-                <w:rFonts w:ascii="Calibri" w:hAnsi="Calibri" w:eastAsia="Calibri"/>
-                <w:b w:val="0"/>
-                <w:sz w:val="20"/>
-              </w:rPr>
-              <w:t>Open license + LiteRT on-device path</w:t>
-            </w:r>
-          </w:p>
-        </w:tc>
-      </w:tr>
-      <w:tr>
-        <w:tc>
-          <w:tcPr>
-            <w:tcW w:type="dxa" w:w="3264"/>
-          </w:tcPr>
-          <w:p>
-            <w:r/>
-            <w:r>
-              <w:rPr>
-                <w:rFonts w:ascii="Calibri" w:hAnsi="Calibri" w:eastAsia="Calibri"/>
-                <w:b w:val="0"/>
-                <w:sz w:val="20"/>
-              </w:rPr>
-              <w:t>Method</w:t>
-            </w:r>
-          </w:p>
-        </w:tc>
-        <w:tc>
-          <w:tcPr>
-            <w:tcW w:type="dxa" w:w="3264"/>
-          </w:tcPr>
-          <w:p>
-            <w:r/>
-            <w:r>
-              <w:rPr>
-                <w:rFonts w:ascii="Calibri" w:hAnsi="Calibri" w:eastAsia="Calibri"/>
-                <w:b w:val="0"/>
-                <w:sz w:val="20"/>
-              </w:rPr>
-              <w:t>QLoRA SFT</w:t>
-            </w:r>
-          </w:p>
-        </w:tc>
-        <w:tc>
-          <w:tcPr>
-            <w:tcW w:type="dxa" w:w="3264"/>
-          </w:tcPr>
-          <w:p>
-            <w:r/>
-            <w:r>
-              <w:rPr>
-                <w:rFonts w:ascii="Calibri" w:hAnsi="Calibri" w:eastAsia="Calibri"/>
-                <w:b w:val="0"/>
-                <w:sz w:val="20"/>
-              </w:rPr>
-              <w:t>Cheap, reversible, low forgetting</w:t>
-            </w:r>
-          </w:p>
-        </w:tc>
-      </w:tr>
-      <w:tr>
-        <w:tc>
-          <w:tcPr>
-            <w:tcW w:type="dxa" w:w="3264"/>
-          </w:tcPr>
-          <w:p>
-            <w:r/>
-            <w:r>
-              <w:rPr>
-                <w:rFonts w:ascii="Calibri" w:hAnsi="Calibri" w:eastAsia="Calibri"/>
-                <w:b w:val="0"/>
-                <w:sz w:val="20"/>
-              </w:rPr>
-              <w:t>Epochs</w:t>
-            </w:r>
-          </w:p>
-        </w:tc>
-        <w:tc>
-          <w:tcPr>
-            <w:tcW w:type="dxa" w:w="3264"/>
-          </w:tcPr>
-          <w:p>
-            <w:r/>
-            <w:r>
-              <w:rPr>
-                <w:rFonts w:ascii="Calibri" w:hAnsi="Calibri" w:eastAsia="Calibri"/>
-                <w:b w:val="0"/>
-                <w:sz w:val="20"/>
-              </w:rPr>
-              <w:t>3</w:t>
-            </w:r>
-          </w:p>
-        </w:tc>
-        <w:tc>
-          <w:tcPr>
-            <w:tcW w:type="dxa" w:w="3264"/>
-          </w:tcPr>
-          <w:p>
-            <w:r/>
-            <w:r>
-              <w:rPr>
-                <w:rFonts w:ascii="Calibri" w:hAnsi="Calibri" w:eastAsia="Calibri"/>
-                <w:b w:val="0"/>
-                <w:sz w:val="20"/>
-              </w:rPr>
-              <w:t>Enough for 16k specialized rows</w:t>
-            </w:r>
-          </w:p>
-        </w:tc>
-      </w:tr>
-      <w:tr>
-        <w:tc>
-          <w:tcPr>
-            <w:tcW w:type="dxa" w:w="3264"/>
-          </w:tcPr>
-          <w:p>
-            <w:r/>
-            <w:r>
-              <w:rPr>
-                <w:rFonts w:ascii="Calibri" w:hAnsi="Calibri" w:eastAsia="Calibri"/>
-                <w:b w:val="0"/>
-                <w:sz w:val="20"/>
-              </w:rPr>
-              <w:t>LR</w:t>
-            </w:r>
-          </w:p>
-        </w:tc>
-        <w:tc>
-          <w:tcPr>
-            <w:tcW w:type="dxa" w:w="3264"/>
-          </w:tcPr>
-          <w:p>
-            <w:r/>
-            <w:r>
-              <w:rPr>
-                <w:rFonts w:ascii="Calibri" w:hAnsi="Calibri" w:eastAsia="Calibri"/>
-                <w:b w:val="0"/>
-                <w:sz w:val="20"/>
-              </w:rPr>
-              <w:t>2e-4 cosine</w:t>
-            </w:r>
-          </w:p>
-        </w:tc>
-        <w:tc>
-          <w:tcPr>
-            <w:tcW w:type="dxa" w:w="3264"/>
-          </w:tcPr>
-          <w:p>
-            <w:r/>
-            <w:r>
-              <w:rPr>
-                <w:rFonts w:ascii="Calibri" w:hAnsi="Calibri" w:eastAsia="Calibri"/>
-                <w:b w:val="0"/>
-                <w:sz w:val="20"/>
-              </w:rPr>
-              <w:t>Standard QLoRA SFT setting</w:t>
-            </w:r>
-          </w:p>
-        </w:tc>
-      </w:tr>
-      <w:tr>
-        <w:tc>
-          <w:tcPr>
-            <w:tcW w:type="dxa" w:w="3264"/>
-          </w:tcPr>
-          <w:p>
-            <w:r/>
-            <w:r>
-              <w:rPr>
-                <w:rFonts w:ascii="Calibri" w:hAnsi="Calibri" w:eastAsia="Calibri"/>
-                <w:b w:val="0"/>
-                <w:sz w:val="20"/>
-              </w:rPr>
-              <w:t>Effective batch</w:t>
-            </w:r>
-          </w:p>
-        </w:tc>
-        <w:tc>
-          <w:tcPr>
-            <w:tcW w:type="dxa" w:w="3264"/>
-          </w:tcPr>
-          <w:p>
-            <w:r/>
-            <w:r>
-              <w:rPr>
-                <w:rFonts w:ascii="Calibri" w:hAnsi="Calibri" w:eastAsia="Calibri"/>
-                <w:b w:val="0"/>
-                <w:sz w:val="20"/>
-              </w:rPr>
-              <w:t>16</w:t>
-            </w:r>
-          </w:p>
-        </w:tc>
-        <w:tc>
-          <w:tcPr>
-            <w:tcW w:type="dxa" w:w="3264"/>
-          </w:tcPr>
-          <w:p>
-            <w:r/>
-            <w:r>
-              <w:rPr>
-                <w:rFonts w:ascii="Calibri" w:hAnsi="Calibri" w:eastAsia="Calibri"/>
-                <w:b w:val="0"/>
-                <w:sz w:val="20"/>
-              </w:rPr>
-              <w:t>Stable JSON formatting</w:t>
-            </w:r>
-          </w:p>
-        </w:tc>
-      </w:tr>
-      <w:tr>
-        <w:tc>
-          <w:tcPr>
-            <w:tcW w:type="dxa" w:w="3264"/>
-          </w:tcPr>
-          <w:p>
-            <w:r/>
-            <w:r>
-              <w:rPr>
-                <w:rFonts w:ascii="Calibri" w:hAnsi="Calibri" w:eastAsia="Calibri"/>
-                <w:b w:val="0"/>
-                <w:sz w:val="20"/>
-              </w:rPr>
-              <w:t>Max sequence</w:t>
-            </w:r>
-          </w:p>
-        </w:tc>
-        <w:tc>
-          <w:tcPr>
-            <w:tcW w:type="dxa" w:w="3264"/>
-          </w:tcPr>
-          <w:p>
-            <w:r/>
-            <w:r>
-              <w:rPr>
-                <w:rFonts w:ascii="Calibri" w:hAnsi="Calibri" w:eastAsia="Calibri"/>
-                <w:b w:val="0"/>
-                <w:sz w:val="20"/>
-              </w:rPr>
-              <w:t>1536 tokens</w:t>
-            </w:r>
-          </w:p>
-        </w:tc>
-        <w:tc>
-          <w:tcPr>
-            <w:tcW w:type="dxa" w:w="3264"/>
-          </w:tcPr>
-          <w:p>
-            <w:r/>
-            <w:r>
-              <w:rPr>
-                <w:rFonts w:ascii="Calibri" w:hAnsi="Calibri" w:eastAsia="Calibri"/>
-                <w:b w:val="0"/>
-                <w:sz w:val="20"/>
-              </w:rPr>
-              <w:t>Fits coach system + SMS</w:t>
-            </w:r>
-          </w:p>
-        </w:tc>
-      </w:tr>
-      <w:tr>
-        <w:tc>
-          <w:tcPr>
-            <w:tcW w:type="dxa" w:w="3264"/>
-          </w:tcPr>
-          <w:p>
-            <w:r/>
-            <w:r>
-              <w:rPr>
-                <w:rFonts w:ascii="Calibri" w:hAnsi="Calibri" w:eastAsia="Calibri"/>
-                <w:b w:val="0"/>
-                <w:sz w:val="20"/>
-              </w:rPr>
-              <w:t>Thinking</w:t>
-            </w:r>
-          </w:p>
-        </w:tc>
-        <w:tc>
-          <w:tcPr>
-            <w:tcW w:type="dxa" w:w="3264"/>
-          </w:tcPr>
-          <w:p>
-            <w:r/>
-            <w:r>
-              <w:rPr>
-                <w:rFonts w:ascii="Calibri" w:hAnsi="Calibri" w:eastAsia="Calibri"/>
-                <w:b w:val="0"/>
-                <w:sz w:val="20"/>
-              </w:rPr>
-              <w:t>Disabled</w:t>
-            </w:r>
-          </w:p>
-        </w:tc>
-        <w:tc>
-          <w:tcPr>
-            <w:tcW w:type="dxa" w:w="3264"/>
-          </w:tcPr>
-          <w:p>
-            <w:r/>
-            <w:r>
-              <w:rPr>
-                <w:rFonts w:ascii="Calibri" w:hAnsi="Calibri" w:eastAsia="Calibri"/>
-                <w:b w:val="0"/>
-                <w:sz w:val="20"/>
-              </w:rPr>
-              <w:t>Phone latency; SMS needs direct JSON</w:t>
-            </w:r>
-          </w:p>
-        </w:tc>
-      </w:tr>
-      <w:tr>
-        <w:tc>
-          <w:tcPr>
-            <w:tcW w:type="dxa" w:w="3264"/>
-          </w:tcPr>
-          <w:p>
-            <w:r/>
-            <w:r>
-              <w:rPr>
-                <w:rFonts w:ascii="Calibri" w:hAnsi="Calibri" w:eastAsia="Calibri"/>
-                <w:b w:val="0"/>
-                <w:sz w:val="20"/>
-              </w:rPr>
-              <w:t>Checkpoint pick</w:t>
-            </w:r>
-          </w:p>
-        </w:tc>
-        <w:tc>
-          <w:tcPr>
-            <w:tcW w:type="dxa" w:w="3264"/>
-          </w:tcPr>
-          <w:p>
-            <w:r/>
-            <w:r>
-              <w:rPr>
-                <w:rFonts w:ascii="Calibri" w:hAnsi="Calibri" w:eastAsia="Calibri"/>
-                <w:b w:val="0"/>
-                <w:sz w:val="20"/>
-              </w:rPr>
-              <w:t>Best val SMS R-EM</w:t>
-            </w:r>
-          </w:p>
-        </w:tc>
-        <w:tc>
-          <w:tcPr>
-            <w:tcW w:type="dxa" w:w="3264"/>
-          </w:tcPr>
-          <w:p>
-            <w:r/>
-            <w:r>
-              <w:rPr>
-                <w:rFonts w:ascii="Calibri" w:hAnsi="Calibri" w:eastAsia="Calibri"/>
-                <w:b w:val="0"/>
-                <w:sz w:val="20"/>
-              </w:rPr>
-              <w:t>Not lowest train loss</w:t>
-            </w:r>
-          </w:p>
-        </w:tc>
-      </w:tr>
-      <w:tr>
-        <w:tc>
-          <w:tcPr>
-            <w:tcW w:type="dxa" w:w="3264"/>
-          </w:tcPr>
-          <w:p>
-            <w:r/>
-            <w:r>
-              <w:rPr>
-                <w:rFonts w:ascii="Calibri" w:hAnsi="Calibri" w:eastAsia="Calibri"/>
-                <w:b w:val="0"/>
-                <w:sz w:val="20"/>
-              </w:rPr>
-              <w:t>Train cost</w:t>
-            </w:r>
-          </w:p>
-        </w:tc>
-        <w:tc>
-          <w:tcPr>
-            <w:tcW w:type="dxa" w:w="3264"/>
-          </w:tcPr>
-          <w:p>
-            <w:r/>
-            <w:r>
-              <w:rPr>
-                <w:rFonts w:ascii="Calibri" w:hAnsi="Calibri" w:eastAsia="Calibri"/>
-                <w:b w:val="0"/>
-                <w:sz w:val="20"/>
-              </w:rPr>
-              <w:t>~$8 / run</w:t>
-            </w:r>
-          </w:p>
-        </w:tc>
-        <w:tc>
-          <w:tcPr>
-            <w:tcW w:type="dxa" w:w="3264"/>
-          </w:tcPr>
-          <w:p>
-            <w:r/>
-            <w:r>
-              <w:rPr>
-                <w:rFonts w:ascii="Calibri" w:hAnsi="Calibri" w:eastAsia="Calibri"/>
-                <w:b w:val="0"/>
-                <w:sz w:val="20"/>
-              </w:rPr>
-              <w:t>Hours on g5.2xlarge, not weeks</w:t>
-            </w:r>
-          </w:p>
-        </w:tc>
-      </w:tr>
-    </w:tbl>
-    <w:p/>
     <w:p>
       <w:pPr>
         <w:pStyle w:val="Heading1"/>
       </w:pPr>
       <w:r>
         <w:rPr>
-          <w:color w:val="0F3D3E"/>
+          <w:color w:val="1A1A1A"/>
         </w:rPr>
-        <w:t>5. Product architecture</w:t>
-      </w:r>
-    </w:p>
-    <w:p>
-      <w:pPr>
-        <w:spacing w:after="160" w:before="0"/>
-      </w:pPr>
-      <w:r>
-        <w:rPr>
-          <w:rFonts w:ascii="Calibri" w:hAnsi="Calibri" w:eastAsia="Calibri"/>
-          <w:b w:val="0"/>
-          <w:sz w:val="22"/>
-        </w:rPr>
-        <w:t>FinnAI SLM is a fallback and a coach — not a replacement for deterministic parsers on known banks.</w:t>
+        <w:t>How we did it</w:t>
       </w:r>
     </w:p>
     <w:p>
@@ -1318,7 +834,7 @@
       <w:r>
         <w:drawing>
           <wp:inline xmlns:a="http://schemas.openxmlformats.org/drawingml/2006/main" xmlns:pic="http://schemas.openxmlformats.org/drawingml/2006/picture">
-            <wp:extent cx="5669280" cy="2920538"/>
+            <wp:extent cx="5669280" cy="1904297"/>
             <wp:docPr id="4" name="Picture 4"/>
             <wp:cNvGraphicFramePr>
               <a:graphicFrameLocks noChangeAspect="1"/>
@@ -1327,7 +843,7 @@
               <a:graphicData uri="http://schemas.openxmlformats.org/drawingml/2006/picture">
                 <pic:pic>
                   <pic:nvPicPr>
-                    <pic:cNvPr id="0" name="architecture.png"/>
+                    <pic:cNvPr id="0" name="pipeline.png"/>
                     <pic:cNvPicPr/>
                   </pic:nvPicPr>
                   <pic:blipFill>
@@ -1339,7 +855,7 @@
                   <pic:spPr>
                     <a:xfrm>
                       <a:off x="0" y="0"/>
-                      <a:ext cx="5669280" cy="2920538"/>
+                      <a:ext cx="5669280" cy="1904297"/>
                     </a:xfrm>
                     <a:prstGeom prst="rect"/>
                   </pic:spPr>
@@ -1359,21 +875,35 @@
           <w:rFonts w:ascii="Calibri" w:hAnsi="Calibri" w:eastAsia="Calibri"/>
           <w:b w:val="0"/>
           <w:i/>
-          <w:color w:val="555555"/>
+          <w:color w:val="666666"/>
           <w:sz w:val="18"/>
         </w:rPr>
-        <w:t>Figure 4 — Regex first; SLM for unknown / Indic / coaching</w:t>
+        <w:t>Figure 4. End to end.</w:t>
       </w:r>
     </w:p>
     <w:p>
       <w:pPr>
-        <w:pStyle w:val="Heading1"/>
+        <w:pStyle w:val="Heading2"/>
       </w:pPr>
       <w:r>
         <w:rPr>
-          <w:color w:val="0F3D3E"/>
+          <w:color w:val="1A1A1A"/>
         </w:rPr>
-        <w:t>6. How we did it — the pipeline</w:t>
+        <w:t>Data</w:t>
+      </w:r>
+    </w:p>
+    <w:p>
+      <w:pPr>
+        <w:spacing w:after="160" w:before="0"/>
+      </w:pPr>
+      <w:r>
+        <w:rPr>
+          <w:rFonts w:ascii="Calibri" w:hAnsi="Calibri" w:eastAsia="Calibri"/>
+          <w:b w:val="0"/>
+          <w:i w:val="0"/>
+          <w:sz w:val="22"/>
+        </w:rPr>
+        <w:t>All training SMS are synthetic: templates with fake amounts and merchants. We know the correct JSON because we generated the text. Coach answers are tied to fake ledgers so every rupee in the reply must appear in the prompt.</w:t>
       </w:r>
     </w:p>
     <w:p>
@@ -1383,7 +913,7 @@
       <w:r>
         <w:drawing>
           <wp:inline xmlns:a="http://schemas.openxmlformats.org/drawingml/2006/main" xmlns:pic="http://schemas.openxmlformats.org/drawingml/2006/picture">
-            <wp:extent cx="5852160" cy="2197916"/>
+            <wp:extent cx="4754880" cy="3038297"/>
             <wp:docPr id="5" name="Picture 5"/>
             <wp:cNvGraphicFramePr>
               <a:graphicFrameLocks noChangeAspect="1"/>
@@ -1392,7 +922,7 @@
               <a:graphicData uri="http://schemas.openxmlformats.org/drawingml/2006/picture">
                 <pic:pic>
                   <pic:nvPicPr>
-                    <pic:cNvPr id="0" name="pipeline.png"/>
+                    <pic:cNvPr id="0" name="data_mix.png"/>
                     <pic:cNvPicPr/>
                   </pic:nvPicPr>
                   <pic:blipFill>
@@ -1404,7 +934,7 @@
                   <pic:spPr>
                     <a:xfrm>
                       <a:off x="0" y="0"/>
-                      <a:ext cx="5852160" cy="2197916"/>
+                      <a:ext cx="4754880" cy="3038297"/>
                     </a:xfrm>
                     <a:prstGeom prst="rect"/>
                   </pic:spPr>
@@ -1424,21 +954,10 @@
           <w:rFonts w:ascii="Calibri" w:hAnsi="Calibri" w:eastAsia="Calibri"/>
           <w:b w:val="0"/>
           <w:i/>
-          <w:color w:val="555555"/>
+          <w:color w:val="666666"/>
           <w:sz w:val="18"/>
         </w:rPr>
-        <w:t>Figure 5 — Five stages from data to ship</w:t>
-      </w:r>
-    </w:p>
-    <w:p>
-      <w:pPr>
-        <w:pStyle w:val="Heading2"/>
-      </w:pPr>
-      <w:r>
-        <w:rPr>
-          <w:color w:val="0F3D3E"/>
-        </w:rPr>
-        <w:t>6.1 Stage 1–2: Privacy-safe data</w:t>
+        <w:t>Figure 5. Mix of tasks in training.</w:t>
       </w:r>
     </w:p>
     <w:p>
@@ -1449,167 +968,36 @@
         <w:rPr>
           <w:rFonts w:ascii="Calibri" w:hAnsi="Calibri" w:eastAsia="Calibri"/>
           <w:b w:val="0"/>
+          <w:i w:val="0"/>
           <w:sz w:val="22"/>
         </w:rPr>
-        <w:t>Plain English: We never trained on real customer SMS. We wrote templates that look like bank messages, filled them with fake amounts and merchants, and generated the correct JSON ourselves — so labels are free and clean.</w:t>
+        <w:t>Splits are by template family, not by line. If you put paraphrases of the same template in both train and test, you fool yourself. We locked that before scoring.</w:t>
       </w:r>
     </w:p>
     <w:p>
       <w:pPr>
-        <w:jc w:val="center"/>
-      </w:pPr>
-      <w:r>
-        <w:drawing>
-          <wp:inline xmlns:a="http://schemas.openxmlformats.org/drawingml/2006/main" xmlns:pic="http://schemas.openxmlformats.org/drawingml/2006/picture">
-            <wp:extent cx="5669280" cy="2378846"/>
-            <wp:docPr id="6" name="Picture 6"/>
-            <wp:cNvGraphicFramePr>
-              <a:graphicFrameLocks noChangeAspect="1"/>
-            </wp:cNvGraphicFramePr>
-            <a:graphic>
-              <a:graphicData uri="http://schemas.openxmlformats.org/drawingml/2006/picture">
-                <pic:pic>
-                  <pic:nvPicPr>
-                    <pic:cNvPr id="0" name="data_mix.png"/>
-                    <pic:cNvPicPr/>
-                  </pic:nvPicPr>
-                  <pic:blipFill>
-                    <a:blip r:embed="rId14"/>
-                    <a:stretch>
-                      <a:fillRect/>
-                    </a:stretch>
-                  </pic:blipFill>
-                  <pic:spPr>
-                    <a:xfrm>
-                      <a:off x="0" y="0"/>
-                      <a:ext cx="5669280" cy="2378846"/>
-                    </a:xfrm>
-                    <a:prstGeom prst="rect"/>
-                  </pic:spPr>
-                </pic:pic>
-              </a:graphicData>
-            </a:graphic>
-          </wp:inline>
-        </w:drawing>
-      </w:r>
-    </w:p>
-    <w:p>
-      <w:pPr>
-        <w:jc w:val="center"/>
+        <w:spacing w:after="200"/>
       </w:pPr>
       <w:r>
         <w:rPr>
           <w:rFonts w:ascii="Calibri" w:hAnsi="Calibri" w:eastAsia="Calibri"/>
           <w:b w:val="0"/>
           <w:i/>
-          <w:color w:val="555555"/>
-          <w:sz w:val="18"/>
+          <w:color w:val="444444"/>
+          <w:sz w:val="20"/>
         </w:rPr>
-        <w:t>Figure 6 — Training mix and data sources</w:t>
+        <w:t>Indic paraphrases (Hindi, Hinglish, etc.) were generated as surface text only and kept only when amount, merchant, and account digits still matched our labels.</w:t>
       </w:r>
     </w:p>
-    <w:p>
-      <w:pPr>
-        <w:jc w:val="center"/>
-      </w:pPr>
-      <w:r>
-        <w:drawing>
-          <wp:inline xmlns:a="http://schemas.openxmlformats.org/drawingml/2006/main" xmlns:pic="http://schemas.openxmlformats.org/drawingml/2006/picture">
-            <wp:extent cx="5669280" cy="2118822"/>
-            <wp:docPr id="7" name="Picture 7"/>
-            <wp:cNvGraphicFramePr>
-              <a:graphicFrameLocks noChangeAspect="1"/>
-            </wp:cNvGraphicFramePr>
-            <a:graphic>
-              <a:graphicData uri="http://schemas.openxmlformats.org/drawingml/2006/picture">
-                <pic:pic>
-                  <pic:nvPicPr>
-                    <pic:cNvPr id="0" name="privacy.png"/>
-                    <pic:cNvPicPr/>
-                  </pic:nvPicPr>
-                  <pic:blipFill>
-                    <a:blip r:embed="rId15"/>
-                    <a:stretch>
-                      <a:fillRect/>
-                    </a:stretch>
-                  </pic:blipFill>
-                  <pic:spPr>
-                    <a:xfrm>
-                      <a:off x="0" y="0"/>
-                      <a:ext cx="5669280" cy="2118822"/>
-                    </a:xfrm>
-                    <a:prstGeom prst="rect"/>
-                  </pic:spPr>
-                </pic:pic>
-              </a:graphicData>
-            </a:graphic>
-          </wp:inline>
-        </w:drawing>
-      </w:r>
-    </w:p>
-    <w:p>
-      <w:pPr>
-        <w:jc w:val="center"/>
-      </w:pPr>
-      <w:r>
-        <w:rPr>
-          <w:rFonts w:ascii="Calibri" w:hAnsi="Calibri" w:eastAsia="Calibri"/>
-          <w:b w:val="0"/>
-          <w:i/>
-          <w:color w:val="555555"/>
-          <w:sz w:val="18"/>
-        </w:rPr>
-        <w:t>Figure 7 — Privacy and ownership pillars</w:t>
-      </w:r>
-    </w:p>
-    <w:tbl>
-      <w:tblPr>
-        <w:tblW w:type="auto" w:w="0"/>
-        <w:tblLook w:firstColumn="1" w:firstRow="1" w:lastColumn="0" w:lastRow="0" w:noHBand="0" w:noVBand="1" w:val="04A0"/>
-      </w:tblPr>
-      <w:tblGrid>
-        <w:gridCol w:w="9792"/>
-      </w:tblGrid>
-      <w:tr>
-        <w:tc>
-          <w:tcPr>
-            <w:tcW w:type="dxa" w:w="9792"/>
-            <w:shd w:fill="E8F4F3"/>
-          </w:tcPr>
-          <w:p>
-            <w:r>
-              <w:rPr>
-                <w:rFonts w:ascii="Calibri" w:hAnsi="Calibri" w:eastAsia="Calibri"/>
-                <w:b/>
-                <w:color w:val="0F3D3E"/>
-                <w:sz w:val="22"/>
-              </w:rPr>
-              <w:t>Technical: split hygiene</w:t>
-            </w:r>
-          </w:p>
-          <w:p>
-            <w:r>
-              <w:rPr>
-                <w:rFonts w:ascii="Calibri" w:hAnsi="Calibri" w:eastAsia="Calibri"/>
-                <w:b w:val="0"/>
-                <w:sz w:val="20"/>
-              </w:rPr>
-              <w:t>The split unit is (bank, template_id), not a single SMS line. All amount/merchant variants of one template stay in train OR val OR test. Seed 42. Target mix train-only: 60% SMS / 25% coach / 15% general. Chat eval is a frozen 50-item set never used in SFT. Nova Pro was used only as a surface-text factory for Indic paraphrases; rows were kept only if amount/merchant/last-4/ledger digits still matched our gold.</w:t>
-            </w:r>
-          </w:p>
-        </w:tc>
-      </w:tr>
-    </w:tbl>
-    <w:p/>
     <w:p>
       <w:pPr>
         <w:pStyle w:val="Heading2"/>
       </w:pPr>
       <w:r>
         <w:rPr>
-          <w:color w:val="0F3D3E"/>
+          <w:color w:val="1A1A1A"/>
         </w:rPr>
-        <w:t>6.2 Stage 3: Training run</w:t>
+        <w:t>How we decided “good enough to ship”</w:t>
       </w:r>
     </w:p>
     <w:p>
@@ -1620,33 +1008,10 @@
         <w:rPr>
           <w:rFonts w:ascii="Calibri" w:hAnsi="Calibri" w:eastAsia="Calibri"/>
           <w:b w:val="0"/>
+          <w:i w:val="0"/>
           <w:sz w:val="22"/>
         </w:rPr>
-        <w:t>Hardware: AWS us-east-2 (Ohio) g5.2xlarge (1× A10G) because Mumbai GPU quota was zero at the time. v2 trained on 16,000 examples. Validation SMS R-EM stayed at 0.965 across all three epochs (stable).</w:t>
-      </w:r>
-    </w:p>
-    <w:p>
-      <w:pPr>
-        <w:pStyle w:val="Heading2"/>
-      </w:pPr>
-      <w:r>
-        <w:rPr>
-          <w:color w:val="0F3D3E"/>
-        </w:rPr>
-        <w:t>6.3 Stage 4: Evaluation — ship gates frozen first</w:t>
-      </w:r>
-    </w:p>
-    <w:p>
-      <w:pPr>
-        <w:spacing w:after="160" w:before="0"/>
-      </w:pPr>
-      <w:r>
-        <w:rPr>
-          <w:rFonts w:ascii="Calibri" w:hAnsi="Calibri" w:eastAsia="Calibri"/>
-          <w:b w:val="0"/>
-          <w:sz w:val="22"/>
-        </w:rPr>
-        <w:t>Plain English: Before looking at final scores, we wrote the pass/fail rules. That stops “it looks good enough” bias.</w:t>
+        <w:t>The pass rules were written before we looked at the final test numbers. Main score: every key field correct (amount, type, merchant, last-4, balance), or empty {} for non-transactions.</w:t>
       </w:r>
     </w:p>
     <w:tbl>
@@ -1656,15 +1021,15 @@
         <w:tblLook w:firstColumn="1" w:firstRow="1" w:lastColumn="0" w:lastRow="0" w:noHBand="0" w:noVBand="1" w:val="04A0"/>
       </w:tblPr>
       <w:tblGrid>
-        <w:gridCol w:w="3264"/>
-        <w:gridCol w:w="3264"/>
-        <w:gridCol w:w="3264"/>
+        <w:gridCol w:w="3216"/>
+        <w:gridCol w:w="3216"/>
+        <w:gridCol w:w="3216"/>
       </w:tblGrid>
       <w:tr>
         <w:tc>
           <w:tcPr>
-            <w:tcW w:type="dxa" w:w="3264"/>
-            <w:shd w:fill="0F3D3E"/>
+            <w:tcW w:type="dxa" w:w="3216"/>
+            <w:shd w:fill="1A1A1A"/>
           </w:tcPr>
           <w:p>
             <w:r/>
@@ -1672,17 +1037,18 @@
               <w:rPr>
                 <w:rFonts w:ascii="Calibri" w:hAnsi="Calibri" w:eastAsia="Calibri"/>
                 <w:b/>
+                <w:i w:val="0"/>
                 <w:color w:val="FFFFFF"/>
                 <w:sz w:val="20"/>
               </w:rPr>
-              <w:t>Gate</w:t>
+              <w:t>Check</w:t>
             </w:r>
           </w:p>
         </w:tc>
         <w:tc>
           <w:tcPr>
-            <w:tcW w:type="dxa" w:w="3264"/>
-            <w:shd w:fill="0F3D3E"/>
+            <w:tcW w:type="dxa" w:w="3216"/>
+            <w:shd w:fill="1A1A1A"/>
           </w:tcPr>
           <w:p>
             <w:r/>
@@ -1690,17 +1056,18 @@
               <w:rPr>
                 <w:rFonts w:ascii="Calibri" w:hAnsi="Calibri" w:eastAsia="Calibri"/>
                 <w:b/>
+                <w:i w:val="0"/>
                 <w:color w:val="FFFFFF"/>
                 <w:sz w:val="20"/>
               </w:rPr>
-              <w:t>Rule</w:t>
+              <w:t>Bar</w:t>
             </w:r>
           </w:p>
         </w:tc>
         <w:tc>
           <w:tcPr>
-            <w:tcW w:type="dxa" w:w="3264"/>
-            <w:shd w:fill="0F3D3E"/>
+            <w:tcW w:type="dxa" w:w="3216"/>
+            <w:shd w:fill="1A1A1A"/>
           </w:tcPr>
           <w:p>
             <w:r/>
@@ -1708,10 +1075,11 @@
               <w:rPr>
                 <w:rFonts w:ascii="Calibri" w:hAnsi="Calibri" w:eastAsia="Calibri"/>
                 <w:b/>
+                <w:i w:val="0"/>
                 <w:color w:val="FFFFFF"/>
                 <w:sz w:val="20"/>
               </w:rPr>
-              <w:t>v2 result</w:t>
+              <w:t>v2</w:t>
             </w:r>
           </w:p>
         </w:tc>
@@ -1719,7 +1087,7 @@
       <w:tr>
         <w:tc>
           <w:tcPr>
-            <w:tcW w:type="dxa" w:w="3264"/>
+            <w:tcW w:type="dxa" w:w="3216"/>
           </w:tcPr>
           <w:p>
             <w:r/>
@@ -1727,15 +1095,16 @@
               <w:rPr>
                 <w:rFonts w:ascii="Calibri" w:hAnsi="Calibri" w:eastAsia="Calibri"/>
                 <w:b w:val="0"/>
+                <w:i w:val="0"/>
                 <w:sz w:val="20"/>
               </w:rPr>
-              <w:t>1. SMS R-EM lift</w:t>
+              <w:t>Beat untuned Qwen3 on SMS</w:t>
             </w:r>
           </w:p>
         </w:tc>
         <w:tc>
           <w:tcPr>
-            <w:tcW w:type="dxa" w:w="3264"/>
+            <w:tcW w:type="dxa" w:w="3216"/>
           </w:tcPr>
           <w:p>
             <w:r/>
@@ -1743,15 +1112,16 @@
               <w:rPr>
                 <w:rFonts w:ascii="Calibri" w:hAnsi="Calibri" w:eastAsia="Calibri"/>
                 <w:b w:val="0"/>
+                <w:i w:val="0"/>
                 <w:sz w:val="20"/>
               </w:rPr>
-              <w:t>≥ +3 pp vs Qwen3-base, CI excludes 0</w:t>
+              <w:t>+3 points, clear gap</w:t>
             </w:r>
           </w:p>
         </w:tc>
         <w:tc>
           <w:tcPr>
-            <w:tcW w:type="dxa" w:w="3264"/>
+            <w:tcW w:type="dxa" w:w="3216"/>
           </w:tcPr>
           <w:p>
             <w:r/>
@@ -1759,9 +1129,10 @@
               <w:rPr>
                 <w:rFonts w:ascii="Calibri" w:hAnsi="Calibri" w:eastAsia="Calibri"/>
                 <w:b w:val="0"/>
+                <w:i w:val="0"/>
                 <w:sz w:val="20"/>
               </w:rPr>
-              <w:t>Pass (+69.8 pp)</w:t>
+              <w:t>Pass</w:t>
             </w:r>
           </w:p>
         </w:tc>
@@ -1769,7 +1140,7 @@
       <w:tr>
         <w:tc>
           <w:tcPr>
-            <w:tcW w:type="dxa" w:w="3264"/>
+            <w:tcW w:type="dxa" w:w="3216"/>
           </w:tcPr>
           <w:p>
             <w:r/>
@@ -1777,15 +1148,16 @@
               <w:rPr>
                 <w:rFonts w:ascii="Calibri" w:hAnsi="Calibri" w:eastAsia="Calibri"/>
                 <w:b w:val="0"/>
+                <w:i w:val="0"/>
                 <w:sz w:val="20"/>
               </w:rPr>
-              <w:t>2. Amount EM</w:t>
+              <w:t>Do not get worse on amounts</w:t>
             </w:r>
           </w:p>
         </w:tc>
         <w:tc>
           <w:tcPr>
-            <w:tcW w:type="dxa" w:w="3264"/>
+            <w:tcW w:type="dxa" w:w="3216"/>
           </w:tcPr>
           <w:p>
             <w:r/>
@@ -1793,15 +1165,16 @@
               <w:rPr>
                 <w:rFonts w:ascii="Calibri" w:hAnsi="Calibri" w:eastAsia="Calibri"/>
                 <w:b w:val="0"/>
+                <w:i w:val="0"/>
                 <w:sz w:val="20"/>
               </w:rPr>
-              <w:t>Drop vs base ≤ 1 pp</w:t>
+              <w:t>Within 1 point of base</w:t>
             </w:r>
           </w:p>
         </w:tc>
         <w:tc>
           <w:tcPr>
-            <w:tcW w:type="dxa" w:w="3264"/>
+            <w:tcW w:type="dxa" w:w="3216"/>
           </w:tcPr>
           <w:p>
             <w:r/>
@@ -1809,9 +1182,10 @@
               <w:rPr>
                 <w:rFonts w:ascii="Calibri" w:hAnsi="Calibri" w:eastAsia="Calibri"/>
                 <w:b w:val="0"/>
+                <w:i w:val="0"/>
                 <w:sz w:val="20"/>
               </w:rPr>
-              <w:t>Pass (+16.7 pp)</w:t>
+              <w:t>Pass</w:t>
             </w:r>
           </w:p>
         </w:tc>
@@ -1819,7 +1193,7 @@
       <w:tr>
         <w:tc>
           <w:tcPr>
-            <w:tcW w:type="dxa" w:w="3264"/>
+            <w:tcW w:type="dxa" w:w="3216"/>
           </w:tcPr>
           <w:p>
             <w:r/>
@@ -1827,15 +1201,16 @@
               <w:rPr>
                 <w:rFonts w:ascii="Calibri" w:hAnsi="Calibri" w:eastAsia="Calibri"/>
                 <w:b w:val="0"/>
+                <w:i w:val="0"/>
                 <w:sz w:val="20"/>
               </w:rPr>
-              <w:t>3. Chat groundedness</w:t>
+              <w:t>Coach does not invent numbers</w:t>
             </w:r>
           </w:p>
         </w:tc>
         <w:tc>
           <w:tcPr>
-            <w:tcW w:type="dxa" w:w="3264"/>
+            <w:tcW w:type="dxa" w:w="3216"/>
           </w:tcPr>
           <w:p>
             <w:r/>
@@ -1843,15 +1218,16 @@
               <w:rPr>
                 <w:rFonts w:ascii="Calibri" w:hAnsi="Calibri" w:eastAsia="Calibri"/>
                 <w:b w:val="0"/>
+                <w:i w:val="0"/>
                 <w:sz w:val="20"/>
               </w:rPr>
-              <w:t>Drop vs base ≤ 5 pp</w:t>
+              <w:t>Within 5 points of base</w:t>
             </w:r>
           </w:p>
         </w:tc>
         <w:tc>
           <w:tcPr>
-            <w:tcW w:type="dxa" w:w="3264"/>
+            <w:tcW w:type="dxa" w:w="3216"/>
           </w:tcPr>
           <w:p>
             <w:r/>
@@ -1859,9 +1235,10 @@
               <w:rPr>
                 <w:rFonts w:ascii="Calibri" w:hAnsi="Calibri" w:eastAsia="Calibri"/>
                 <w:b w:val="0"/>
+                <w:i w:val="0"/>
                 <w:sz w:val="20"/>
               </w:rPr>
-              <w:t>Pass (+42 pp)</w:t>
+              <w:t>Pass</w:t>
             </w:r>
           </w:p>
         </w:tc>
@@ -1869,7 +1246,7 @@
       <w:tr>
         <w:tc>
           <w:tcPr>
-            <w:tcW w:type="dxa" w:w="3264"/>
+            <w:tcW w:type="dxa" w:w="3216"/>
           </w:tcPr>
           <w:p>
             <w:r/>
@@ -1877,15 +1254,16 @@
               <w:rPr>
                 <w:rFonts w:ascii="Calibri" w:hAnsi="Calibri" w:eastAsia="Calibri"/>
                 <w:b w:val="0"/>
+                <w:i w:val="0"/>
                 <w:sz w:val="20"/>
               </w:rPr>
-              <w:t>4. JSON valid</w:t>
+              <w:t>Valid JSON</w:t>
             </w:r>
           </w:p>
         </w:tc>
         <w:tc>
           <w:tcPr>
-            <w:tcW w:type="dxa" w:w="3264"/>
+            <w:tcW w:type="dxa" w:w="3216"/>
           </w:tcPr>
           <w:p>
             <w:r/>
@@ -1893,6 +1271,7 @@
               <w:rPr>
                 <w:rFonts w:ascii="Calibri" w:hAnsi="Calibri" w:eastAsia="Calibri"/>
                 <w:b w:val="0"/>
+                <w:i w:val="0"/>
                 <w:sz w:val="20"/>
               </w:rPr>
               <w:t>≥ 95%</w:t>
@@ -1901,7 +1280,7 @@
         </w:tc>
         <w:tc>
           <w:tcPr>
-            <w:tcW w:type="dxa" w:w="3264"/>
+            <w:tcW w:type="dxa" w:w="3216"/>
           </w:tcPr>
           <w:p>
             <w:r/>
@@ -1909,9 +1288,10 @@
               <w:rPr>
                 <w:rFonts w:ascii="Calibri" w:hAnsi="Calibri" w:eastAsia="Calibri"/>
                 <w:b w:val="0"/>
+                <w:i w:val="0"/>
                 <w:sz w:val="20"/>
               </w:rPr>
-              <w:t>Pass (100%)</w:t>
+              <w:t>100%</w:t>
             </w:r>
           </w:p>
         </w:tc>
@@ -1919,7 +1299,7 @@
       <w:tr>
         <w:tc>
           <w:tcPr>
-            <w:tcW w:type="dxa" w:w="3264"/>
+            <w:tcW w:type="dxa" w:w="3216"/>
           </w:tcPr>
           <w:p>
             <w:r/>
@@ -1927,15 +1307,16 @@
               <w:rPr>
                 <w:rFonts w:ascii="Calibri" w:hAnsi="Calibri" w:eastAsia="Calibri"/>
                 <w:b w:val="0"/>
+                <w:i w:val="0"/>
                 <w:sz w:val="20"/>
               </w:rPr>
-              <w:t>5. On-device cost</w:t>
+              <w:t>Beat old on-device baseline</w:t>
             </w:r>
           </w:p>
         </w:tc>
         <w:tc>
           <w:tcPr>
-            <w:tcW w:type="dxa" w:w="3264"/>
+            <w:tcW w:type="dxa" w:w="3216"/>
           </w:tcPr>
           <w:p>
             <w:r/>
@@ -1943,15 +1324,16 @@
               <w:rPr>
                 <w:rFonts w:ascii="Calibri" w:hAnsi="Calibri" w:eastAsia="Calibri"/>
                 <w:b w:val="0"/>
+                <w:i w:val="0"/>
                 <w:sz w:val="20"/>
               </w:rPr>
-              <w:t>TTFT/RSS ≤ 1.3× old model</w:t>
+              <w:t>R-EM ≥ old model</w:t>
             </w:r>
           </w:p>
         </w:tc>
         <w:tc>
           <w:tcPr>
-            <w:tcW w:type="dxa" w:w="3264"/>
+            <w:tcW w:type="dxa" w:w="3216"/>
           </w:tcPr>
           <w:p>
             <w:r/>
@@ -1959,9 +1341,10 @@
               <w:rPr>
                 <w:rFonts w:ascii="Calibri" w:hAnsi="Calibri" w:eastAsia="Calibri"/>
                 <w:b w:val="0"/>
+                <w:i w:val="0"/>
                 <w:sz w:val="20"/>
               </w:rPr>
-              <w:t>Pending device bench</w:t>
+              <w:t>Pass</w:t>
             </w:r>
           </w:p>
         </w:tc>
@@ -1969,7 +1352,7 @@
       <w:tr>
         <w:tc>
           <w:tcPr>
-            <w:tcW w:type="dxa" w:w="3264"/>
+            <w:tcW w:type="dxa" w:w="3216"/>
           </w:tcPr>
           <w:p>
             <w:r/>
@@ -1977,15 +1360,16 @@
               <w:rPr>
                 <w:rFonts w:ascii="Calibri" w:hAnsi="Calibri" w:eastAsia="Calibri"/>
                 <w:b w:val="0"/>
+                <w:i w:val="0"/>
                 <w:sz w:val="20"/>
               </w:rPr>
-              <w:t>RQ3 product</w:t>
+              <w:t>Phone speed / memory</w:t>
             </w:r>
           </w:p>
         </w:tc>
         <w:tc>
           <w:tcPr>
-            <w:tcW w:type="dxa" w:w="3264"/>
+            <w:tcW w:type="dxa" w:w="3216"/>
           </w:tcPr>
           <w:p>
             <w:r/>
@@ -1993,15 +1377,16 @@
               <w:rPr>
                 <w:rFonts w:ascii="Calibri" w:hAnsi="Calibri" w:eastAsia="Calibri"/>
                 <w:b w:val="0"/>
+                <w:i w:val="0"/>
                 <w:sz w:val="20"/>
               </w:rPr>
-              <w:t>R-EM ≥ Qwen2.5-1.5B</w:t>
+              <w:t>Comparable to old model</w:t>
             </w:r>
           </w:p>
         </w:tc>
         <w:tc>
           <w:tcPr>
-            <w:tcW w:type="dxa" w:w="3264"/>
+            <w:tcW w:type="dxa" w:w="3216"/>
           </w:tcPr>
           <w:p>
             <w:r/>
@@ -2009,48 +1394,10 @@
               <w:rPr>
                 <w:rFonts w:ascii="Calibri" w:hAnsi="Calibri" w:eastAsia="Calibri"/>
                 <w:b w:val="0"/>
+                <w:i w:val="0"/>
                 <w:sz w:val="20"/>
               </w:rPr>
-              <w:t>Pass (97.97 &gt; 42.43)</w:t>
-            </w:r>
-          </w:p>
-        </w:tc>
-      </w:tr>
-    </w:tbl>
-    <w:p/>
-    <w:tbl>
-      <w:tblPr>
-        <w:tblW w:type="auto" w:w="0"/>
-        <w:tblLook w:firstColumn="1" w:firstRow="1" w:lastColumn="0" w:lastRow="0" w:noHBand="0" w:noVBand="1" w:val="04A0"/>
-      </w:tblPr>
-      <w:tblGrid>
-        <w:gridCol w:w="9792"/>
-      </w:tblGrid>
-      <w:tr>
-        <w:tc>
-          <w:tcPr>
-            <w:tcW w:type="dxa" w:w="9792"/>
-            <w:shd w:fill="E8F4F3"/>
-          </w:tcPr>
-          <w:p>
-            <w:r>
-              <w:rPr>
-                <w:rFonts w:ascii="Calibri" w:hAnsi="Calibri" w:eastAsia="Calibri"/>
-                <w:b/>
-                <w:color w:val="0F3D3E"/>
-                <w:sz w:val="22"/>
-              </w:rPr>
-              <w:t>Technical: primary metric</w:t>
-            </w:r>
-          </w:p>
-          <w:p>
-            <w:r>
-              <w:rPr>
-                <w:rFonts w:ascii="Calibri" w:hAnsi="Calibri" w:eastAsia="Calibri"/>
-                <w:b w:val="0"/>
-                <w:sz w:val="20"/>
-              </w:rPr>
-              <w:t>Strict Record Exact-Match (R-EM) requires amount + type + merchant + account last-4 + balance all correct (or {} for non-transactions). We also report amount EM, merchant exact, field micro-F1, false-parse rate, bootstrap 95% CIs (10k resamples), and McNemar p vs base.</w:t>
+              <w:t>Still to measure on device</w:t>
             </w:r>
           </w:p>
         </w:tc>
@@ -2059,37 +1406,13 @@
     <w:p/>
     <w:p>
       <w:pPr>
-        <w:pStyle w:val="Heading2"/>
-      </w:pPr>
-      <w:r>
-        <w:rPr>
-          <w:color w:val="0F3D3E"/>
-        </w:rPr>
-        <w:t>6.4 Stage 5: On-device + open source</w:t>
-      </w:r>
-    </w:p>
-    <w:p>
-      <w:pPr>
-        <w:spacing w:after="160" w:before="0"/>
-      </w:pPr>
-      <w:r>
-        <w:rPr>
-          <w:rFonts w:ascii="Calibri" w:hAnsi="Calibri" w:eastAsia="Calibri"/>
-          <w:b w:val="0"/>
-          <w:sz w:val="22"/>
-        </w:rPr>
-        <w:t>Production path: merge LoRA → export INT4 LiteRT-LM (~0.9 GB) → CloudFront for the app. Scientific copy: Hugging Face model + dataset + GitHub toolkit so others can reproduce or adapt.</w:t>
-      </w:r>
-    </w:p>
-    <w:p>
-      <w:pPr>
         <w:pStyle w:val="Heading1"/>
       </w:pPr>
       <w:r>
         <w:rPr>
-          <w:color w:val="0F3D3E"/>
+          <w:color w:val="1A1A1A"/>
         </w:rPr>
-        <w:t>7. Results that matter to the business</w:t>
+        <w:t>Numbers</w:t>
       </w:r>
     </w:p>
     <w:tbl>
@@ -2099,16 +1422,16 @@
         <w:tblLook w:firstColumn="1" w:firstRow="1" w:lastColumn="0" w:lastRow="0" w:noHBand="0" w:noVBand="1" w:val="04A0"/>
       </w:tblPr>
       <w:tblGrid>
-        <w:gridCol w:w="2448"/>
-        <w:gridCol w:w="2448"/>
-        <w:gridCol w:w="2448"/>
-        <w:gridCol w:w="2448"/>
+        <w:gridCol w:w="2412"/>
+        <w:gridCol w:w="2412"/>
+        <w:gridCol w:w="2412"/>
+        <w:gridCol w:w="2412"/>
       </w:tblGrid>
       <w:tr>
         <w:tc>
           <w:tcPr>
-            <w:tcW w:type="dxa" w:w="2448"/>
-            <w:shd w:fill="0F3D3E"/>
+            <w:tcW w:type="dxa" w:w="2412"/>
+            <w:shd w:fill="1A1A1A"/>
           </w:tcPr>
           <w:p>
             <w:r/>
@@ -2116,17 +1439,17 @@
               <w:rPr>
                 <w:rFonts w:ascii="Calibri" w:hAnsi="Calibri" w:eastAsia="Calibri"/>
                 <w:b/>
+                <w:i w:val="0"/>
                 <w:color w:val="FFFFFF"/>
                 <w:sz w:val="20"/>
               </w:rPr>
-              <w:t>Metric</w:t>
             </w:r>
           </w:p>
         </w:tc>
         <w:tc>
           <w:tcPr>
-            <w:tcW w:type="dxa" w:w="2448"/>
-            <w:shd w:fill="0F3D3E"/>
+            <w:tcW w:type="dxa" w:w="2412"/>
+            <w:shd w:fill="1A1A1A"/>
           </w:tcPr>
           <w:p>
             <w:r/>
@@ -2134,6 +1457,7 @@
               <w:rPr>
                 <w:rFonts w:ascii="Calibri" w:hAnsi="Calibri" w:eastAsia="Calibri"/>
                 <w:b/>
+                <w:i w:val="0"/>
                 <w:color w:val="FFFFFF"/>
                 <w:sz w:val="20"/>
               </w:rPr>
@@ -2143,8 +1467,8 @@
         </w:tc>
         <w:tc>
           <w:tcPr>
-            <w:tcW w:type="dxa" w:w="2448"/>
-            <w:shd w:fill="0F3D3E"/>
+            <w:tcW w:type="dxa" w:w="2412"/>
+            <w:shd w:fill="1A1A1A"/>
           </w:tcPr>
           <w:p>
             <w:r/>
@@ -2152,6 +1476,7 @@
               <w:rPr>
                 <w:rFonts w:ascii="Calibri" w:hAnsi="Calibri" w:eastAsia="Calibri"/>
                 <w:b/>
+                <w:i w:val="0"/>
                 <w:color w:val="FFFFFF"/>
                 <w:sz w:val="20"/>
               </w:rPr>
@@ -2161,8 +1486,8 @@
         </w:tc>
         <w:tc>
           <w:tcPr>
-            <w:tcW w:type="dxa" w:w="2448"/>
-            <w:shd w:fill="0F3D3E"/>
+            <w:tcW w:type="dxa" w:w="2412"/>
+            <w:shd w:fill="1A1A1A"/>
           </w:tcPr>
           <w:p>
             <w:r/>
@@ -2170,10 +1495,11 @@
               <w:rPr>
                 <w:rFonts w:ascii="Calibri" w:hAnsi="Calibri" w:eastAsia="Calibri"/>
                 <w:b/>
+                <w:i w:val="0"/>
                 <w:color w:val="FFFFFF"/>
                 <w:sz w:val="20"/>
               </w:rPr>
-              <w:t>Qwen3 base</w:t>
+              <w:t>Untuned Qwen3</w:t>
             </w:r>
           </w:p>
         </w:tc>
@@ -2181,7 +1507,7 @@
       <w:tr>
         <w:tc>
           <w:tcPr>
-            <w:tcW w:type="dxa" w:w="2448"/>
+            <w:tcW w:type="dxa" w:w="2412"/>
           </w:tcPr>
           <w:p>
             <w:r/>
@@ -2189,15 +1515,16 @@
               <w:rPr>
                 <w:rFonts w:ascii="Calibri" w:hAnsi="Calibri" w:eastAsia="Calibri"/>
                 <w:b w:val="0"/>
+                <w:i w:val="0"/>
                 <w:sz w:val="20"/>
               </w:rPr>
-              <w:t>SMS R-EM %</w:t>
+              <w:t>SMS fully correct</w:t>
             </w:r>
           </w:p>
         </w:tc>
         <w:tc>
           <w:tcPr>
-            <w:tcW w:type="dxa" w:w="2448"/>
+            <w:tcW w:type="dxa" w:w="2412"/>
           </w:tcPr>
           <w:p>
             <w:r/>
@@ -2205,15 +1532,16 @@
               <w:rPr>
                 <w:rFonts w:ascii="Calibri" w:hAnsi="Calibri" w:eastAsia="Calibri"/>
                 <w:b w:val="0"/>
+                <w:i w:val="0"/>
                 <w:sz w:val="20"/>
               </w:rPr>
-              <w:t>97.97</w:t>
+              <w:t>98.0%</w:t>
             </w:r>
           </w:p>
         </w:tc>
         <w:tc>
           <w:tcPr>
-            <w:tcW w:type="dxa" w:w="2448"/>
+            <w:tcW w:type="dxa" w:w="2412"/>
           </w:tcPr>
           <w:p>
             <w:r/>
@@ -2221,15 +1549,16 @@
               <w:rPr>
                 <w:rFonts w:ascii="Calibri" w:hAnsi="Calibri" w:eastAsia="Calibri"/>
                 <w:b w:val="0"/>
+                <w:i w:val="0"/>
                 <w:sz w:val="20"/>
               </w:rPr>
-              <w:t>92.75</w:t>
+              <w:t>92.8%</w:t>
             </w:r>
           </w:p>
         </w:tc>
         <w:tc>
           <w:tcPr>
-            <w:tcW w:type="dxa" w:w="2448"/>
+            <w:tcW w:type="dxa" w:w="2412"/>
           </w:tcPr>
           <w:p>
             <w:r/>
@@ -2237,9 +1566,10 @@
               <w:rPr>
                 <w:rFonts w:ascii="Calibri" w:hAnsi="Calibri" w:eastAsia="Calibri"/>
                 <w:b w:val="0"/>
+                <w:i w:val="0"/>
                 <w:sz w:val="20"/>
               </w:rPr>
-              <w:t>28.16</w:t>
+              <w:t>28.2%</w:t>
             </w:r>
           </w:p>
         </w:tc>
@@ -2247,7 +1577,7 @@
       <w:tr>
         <w:tc>
           <w:tcPr>
-            <w:tcW w:type="dxa" w:w="2448"/>
+            <w:tcW w:type="dxa" w:w="2412"/>
           </w:tcPr>
           <w:p>
             <w:r/>
@@ -2255,15 +1585,16 @@
               <w:rPr>
                 <w:rFonts w:ascii="Calibri" w:hAnsi="Calibri" w:eastAsia="Calibri"/>
                 <w:b w:val="0"/>
+                <w:i w:val="0"/>
                 <w:sz w:val="20"/>
               </w:rPr>
-              <w:t>Amount EM %</w:t>
+              <w:t>Amount correct</w:t>
             </w:r>
           </w:p>
         </w:tc>
         <w:tc>
           <w:tcPr>
-            <w:tcW w:type="dxa" w:w="2448"/>
+            <w:tcW w:type="dxa" w:w="2412"/>
           </w:tcPr>
           <w:p>
             <w:r/>
@@ -2271,15 +1602,16 @@
               <w:rPr>
                 <w:rFonts w:ascii="Calibri" w:hAnsi="Calibri" w:eastAsia="Calibri"/>
                 <w:b w:val="0"/>
+                <w:i w:val="0"/>
                 <w:sz w:val="20"/>
               </w:rPr>
-              <w:t>99.53</w:t>
+              <w:t>99.5%</w:t>
             </w:r>
           </w:p>
         </w:tc>
         <w:tc>
           <w:tcPr>
-            <w:tcW w:type="dxa" w:w="2448"/>
+            <w:tcW w:type="dxa" w:w="2412"/>
           </w:tcPr>
           <w:p>
             <w:r/>
@@ -2287,15 +1619,16 @@
               <w:rPr>
                 <w:rFonts w:ascii="Calibri" w:hAnsi="Calibri" w:eastAsia="Calibri"/>
                 <w:b w:val="0"/>
+                <w:i w:val="0"/>
                 <w:sz w:val="20"/>
               </w:rPr>
-              <w:t>94.60</w:t>
+              <w:t>94.6%</w:t>
             </w:r>
           </w:p>
         </w:tc>
         <w:tc>
           <w:tcPr>
-            <w:tcW w:type="dxa" w:w="2448"/>
+            <w:tcW w:type="dxa" w:w="2412"/>
           </w:tcPr>
           <w:p>
             <w:r/>
@@ -2303,9 +1636,10 @@
               <w:rPr>
                 <w:rFonts w:ascii="Calibri" w:hAnsi="Calibri" w:eastAsia="Calibri"/>
                 <w:b w:val="0"/>
+                <w:i w:val="0"/>
                 <w:sz w:val="20"/>
               </w:rPr>
-              <w:t>82.84</w:t>
+              <w:t>82.8%</w:t>
             </w:r>
           </w:p>
         </w:tc>
@@ -2313,7 +1647,7 @@
       <w:tr>
         <w:tc>
           <w:tcPr>
-            <w:tcW w:type="dxa" w:w="2448"/>
+            <w:tcW w:type="dxa" w:w="2412"/>
           </w:tcPr>
           <w:p>
             <w:r/>
@@ -2321,15 +1655,16 @@
               <w:rPr>
                 <w:rFonts w:ascii="Calibri" w:hAnsi="Calibri" w:eastAsia="Calibri"/>
                 <w:b w:val="0"/>
+                <w:i w:val="0"/>
                 <w:sz w:val="20"/>
               </w:rPr>
-              <w:t>Merchant exact %</w:t>
+              <w:t>Merchant correct</w:t>
             </w:r>
           </w:p>
         </w:tc>
         <w:tc>
           <w:tcPr>
-            <w:tcW w:type="dxa" w:w="2448"/>
+            <w:tcW w:type="dxa" w:w="2412"/>
           </w:tcPr>
           <w:p>
             <w:r/>
@@ -2337,15 +1672,16 @@
               <w:rPr>
                 <w:rFonts w:ascii="Calibri" w:hAnsi="Calibri" w:eastAsia="Calibri"/>
                 <w:b w:val="0"/>
+                <w:i w:val="0"/>
                 <w:sz w:val="20"/>
               </w:rPr>
-              <w:t>98.21</w:t>
+              <w:t>98.2%</w:t>
             </w:r>
           </w:p>
         </w:tc>
         <w:tc>
           <w:tcPr>
-            <w:tcW w:type="dxa" w:w="2448"/>
+            <w:tcW w:type="dxa" w:w="2412"/>
           </w:tcPr>
           <w:p>
             <w:r/>
@@ -2353,15 +1689,16 @@
               <w:rPr>
                 <w:rFonts w:ascii="Calibri" w:hAnsi="Calibri" w:eastAsia="Calibri"/>
                 <w:b w:val="0"/>
+                <w:i w:val="0"/>
                 <w:sz w:val="20"/>
               </w:rPr>
-              <w:t>93.12</w:t>
+              <w:t>93.1%</w:t>
             </w:r>
           </w:p>
         </w:tc>
         <w:tc>
           <w:tcPr>
-            <w:tcW w:type="dxa" w:w="2448"/>
+            <w:tcW w:type="dxa" w:w="2412"/>
           </w:tcPr>
           <w:p>
             <w:r/>
@@ -2369,9 +1706,10 @@
               <w:rPr>
                 <w:rFonts w:ascii="Calibri" w:hAnsi="Calibri" w:eastAsia="Calibri"/>
                 <w:b w:val="0"/>
+                <w:i w:val="0"/>
                 <w:sz w:val="20"/>
               </w:rPr>
-              <w:t>61.31</w:t>
+              <w:t>61.3%</w:t>
             </w:r>
           </w:p>
         </w:tc>
@@ -2379,7 +1717,7 @@
       <w:tr>
         <w:tc>
           <w:tcPr>
-            <w:tcW w:type="dxa" w:w="2448"/>
+            <w:tcW w:type="dxa" w:w="2412"/>
           </w:tcPr>
           <w:p>
             <w:r/>
@@ -2387,15 +1725,16 @@
               <w:rPr>
                 <w:rFonts w:ascii="Calibri" w:hAnsi="Calibri" w:eastAsia="Calibri"/>
                 <w:b w:val="0"/>
+                <w:i w:val="0"/>
                 <w:sz w:val="20"/>
               </w:rPr>
-              <w:t>False-parse % (lower better)</w:t>
+              <w:t>OTP/promo wrongly parsed</w:t>
             </w:r>
           </w:p>
         </w:tc>
         <w:tc>
           <w:tcPr>
-            <w:tcW w:type="dxa" w:w="2448"/>
+            <w:tcW w:type="dxa" w:w="2412"/>
           </w:tcPr>
           <w:p>
             <w:r/>
@@ -2403,15 +1742,16 @@
               <w:rPr>
                 <w:rFonts w:ascii="Calibri" w:hAnsi="Calibri" w:eastAsia="Calibri"/>
                 <w:b w:val="0"/>
+                <w:i w:val="0"/>
                 <w:sz w:val="20"/>
               </w:rPr>
-              <w:t>0.54</w:t>
+              <w:t>0.5%</w:t>
             </w:r>
           </w:p>
         </w:tc>
         <w:tc>
           <w:tcPr>
-            <w:tcW w:type="dxa" w:w="2448"/>
+            <w:tcW w:type="dxa" w:w="2412"/>
           </w:tcPr>
           <w:p>
             <w:r/>
@@ -2419,15 +1759,16 @@
               <w:rPr>
                 <w:rFonts w:ascii="Calibri" w:hAnsi="Calibri" w:eastAsia="Calibri"/>
                 <w:b w:val="0"/>
+                <w:i w:val="0"/>
                 <w:sz w:val="20"/>
               </w:rPr>
-              <w:t>28.57</w:t>
+              <w:t>28.6%</w:t>
             </w:r>
           </w:p>
         </w:tc>
         <w:tc>
           <w:tcPr>
-            <w:tcW w:type="dxa" w:w="2448"/>
+            <w:tcW w:type="dxa" w:w="2412"/>
           </w:tcPr>
           <w:p>
             <w:r/>
@@ -2435,9 +1776,10 @@
               <w:rPr>
                 <w:rFonts w:ascii="Calibri" w:hAnsi="Calibri" w:eastAsia="Calibri"/>
                 <w:b w:val="0"/>
+                <w:i w:val="0"/>
                 <w:sz w:val="20"/>
               </w:rPr>
-              <w:t>100</w:t>
+              <w:t>100%</w:t>
             </w:r>
           </w:p>
         </w:tc>
@@ -2445,7 +1787,7 @@
       <w:tr>
         <w:tc>
           <w:tcPr>
-            <w:tcW w:type="dxa" w:w="2448"/>
+            <w:tcW w:type="dxa" w:w="2412"/>
           </w:tcPr>
           <w:p>
             <w:r/>
@@ -2453,15 +1795,16 @@
               <w:rPr>
                 <w:rFonts w:ascii="Calibri" w:hAnsi="Calibri" w:eastAsia="Calibri"/>
                 <w:b w:val="0"/>
+                <w:i w:val="0"/>
                 <w:sz w:val="20"/>
               </w:rPr>
-              <w:t>Chat groundedness %</w:t>
+              <w:t>Coach grounded in ledger</w:t>
             </w:r>
           </w:p>
         </w:tc>
         <w:tc>
           <w:tcPr>
-            <w:tcW w:type="dxa" w:w="2448"/>
+            <w:tcW w:type="dxa" w:w="2412"/>
           </w:tcPr>
           <w:p>
             <w:r/>
@@ -2469,15 +1812,16 @@
               <w:rPr>
                 <w:rFonts w:ascii="Calibri" w:hAnsi="Calibri" w:eastAsia="Calibri"/>
                 <w:b w:val="0"/>
+                <w:i w:val="0"/>
                 <w:sz w:val="20"/>
               </w:rPr>
-              <w:t>68.0</w:t>
+              <w:t>68%</w:t>
             </w:r>
           </w:p>
         </w:tc>
         <w:tc>
           <w:tcPr>
-            <w:tcW w:type="dxa" w:w="2448"/>
+            <w:tcW w:type="dxa" w:w="2412"/>
           </w:tcPr>
           <w:p>
             <w:r/>
@@ -2485,15 +1829,16 @@
               <w:rPr>
                 <w:rFonts w:ascii="Calibri" w:hAnsi="Calibri" w:eastAsia="Calibri"/>
                 <w:b w:val="0"/>
+                <w:i w:val="0"/>
                 <w:sz w:val="20"/>
               </w:rPr>
-              <w:t>32.0</w:t>
+              <w:t>32%</w:t>
             </w:r>
           </w:p>
         </w:tc>
         <w:tc>
           <w:tcPr>
-            <w:tcW w:type="dxa" w:w="2448"/>
+            <w:tcW w:type="dxa" w:w="2412"/>
           </w:tcPr>
           <w:p>
             <w:r/>
@@ -2501,9 +1846,10 @@
               <w:rPr>
                 <w:rFonts w:ascii="Calibri" w:hAnsi="Calibri" w:eastAsia="Calibri"/>
                 <w:b w:val="0"/>
+                <w:i w:val="0"/>
                 <w:sz w:val="20"/>
               </w:rPr>
-              <w:t>26.0</w:t>
+              <w:t>26%</w:t>
             </w:r>
           </w:p>
         </w:tc>
@@ -2518,9 +1864,10 @@
         <w:rPr>
           <w:rFonts w:ascii="Calibri" w:hAnsi="Calibri" w:eastAsia="Calibri"/>
           <w:b w:val="0"/>
+          <w:i w:val="0"/>
           <w:sz w:val="22"/>
         </w:rPr>
-        <w:t>Business reading: v2 almost eliminated “OTP treated as a payment” style mistakes (false-parse 28% → 0.5%) and more than doubled grounded coach answers. That is user trust, not just a leaderboard number.</w:t>
+        <w:t>The false-parse drop matters in product terms: fewer OTPs showing up as spends. Coach groundedness doubled from v1 to v2 — still not perfect, but usable.</w:t>
       </w:r>
     </w:p>
     <w:p>
@@ -2529,253 +1876,9 @@
       </w:pPr>
       <w:r>
         <w:rPr>
-          <w:color w:val="0F3D3E"/>
+          <w:color w:val="1A1A1A"/>
         </w:rPr>
-        <w:t>8. Cost &amp; time (CXO view)</w:t>
-      </w:r>
-    </w:p>
-    <w:tbl>
-      <w:tblPr>
-        <w:tblStyle w:val="TableGrid"/>
-        <w:tblW w:type="auto" w:w="0"/>
-        <w:tblLook w:firstColumn="1" w:firstRow="1" w:lastColumn="0" w:lastRow="0" w:noHBand="0" w:noVBand="1" w:val="04A0"/>
-      </w:tblPr>
-      <w:tblGrid>
-        <w:gridCol w:w="4896"/>
-        <w:gridCol w:w="4896"/>
-      </w:tblGrid>
-      <w:tr>
-        <w:tc>
-          <w:tcPr>
-            <w:tcW w:type="dxa" w:w="4896"/>
-            <w:shd w:fill="0F3D3E"/>
-          </w:tcPr>
-          <w:p>
-            <w:r/>
-            <w:r>
-              <w:rPr>
-                <w:rFonts w:ascii="Calibri" w:hAnsi="Calibri" w:eastAsia="Calibri"/>
-                <w:b/>
-                <w:color w:val="FFFFFF"/>
-                <w:sz w:val="20"/>
-              </w:rPr>
-              <w:t>Item</w:t>
-            </w:r>
-          </w:p>
-        </w:tc>
-        <w:tc>
-          <w:tcPr>
-            <w:tcW w:type="dxa" w:w="4896"/>
-            <w:shd w:fill="0F3D3E"/>
-          </w:tcPr>
-          <w:p>
-            <w:r/>
-            <w:r>
-              <w:rPr>
-                <w:rFonts w:ascii="Calibri" w:hAnsi="Calibri" w:eastAsia="Calibri"/>
-                <w:b/>
-                <w:color w:val="FFFFFF"/>
-                <w:sz w:val="20"/>
-              </w:rPr>
-              <w:t>Approx. cost</w:t>
-            </w:r>
-          </w:p>
-        </w:tc>
-      </w:tr>
-      <w:tr>
-        <w:tc>
-          <w:tcPr>
-            <w:tcW w:type="dxa" w:w="4896"/>
-          </w:tcPr>
-          <w:p>
-            <w:r/>
-            <w:r>
-              <w:rPr>
-                <w:rFonts w:ascii="Calibri" w:hAnsi="Calibri" w:eastAsia="Calibri"/>
-                <w:b w:val="0"/>
-                <w:sz w:val="20"/>
-              </w:rPr>
-              <w:t>One train run (g5.2xlarge ~5h)</w:t>
-            </w:r>
-          </w:p>
-        </w:tc>
-        <w:tc>
-          <w:tcPr>
-            <w:tcW w:type="dxa" w:w="4896"/>
-          </w:tcPr>
-          <w:p>
-            <w:r/>
-            <w:r>
-              <w:rPr>
-                <w:rFonts w:ascii="Calibri" w:hAnsi="Calibri" w:eastAsia="Calibri"/>
-                <w:b w:val="0"/>
-                <w:sz w:val="20"/>
-              </w:rPr>
-              <w:t>~$7–8</w:t>
-            </w:r>
-          </w:p>
-        </w:tc>
-      </w:tr>
-      <w:tr>
-        <w:tc>
-          <w:tcPr>
-            <w:tcW w:type="dxa" w:w="4896"/>
-          </w:tcPr>
-          <w:p>
-            <w:r/>
-            <w:r>
-              <w:rPr>
-                <w:rFonts w:ascii="Calibri" w:hAnsi="Calibri" w:eastAsia="Calibri"/>
-                <w:b w:val="0"/>
-                <w:sz w:val="20"/>
-              </w:rPr>
-              <w:t>Held-out eval (~3 models)</w:t>
-            </w:r>
-          </w:p>
-        </w:tc>
-        <w:tc>
-          <w:tcPr>
-            <w:tcW w:type="dxa" w:w="4896"/>
-          </w:tcPr>
-          <w:p>
-            <w:r/>
-            <w:r>
-              <w:rPr>
-                <w:rFonts w:ascii="Calibri" w:hAnsi="Calibri" w:eastAsia="Calibri"/>
-                <w:b w:val="0"/>
-                <w:sz w:val="20"/>
-              </w:rPr>
-              <w:t>~$6</w:t>
-            </w:r>
-          </w:p>
-        </w:tc>
-      </w:tr>
-      <w:tr>
-        <w:tc>
-          <w:tcPr>
-            <w:tcW w:type="dxa" w:w="4896"/>
-          </w:tcPr>
-          <w:p>
-            <w:r/>
-            <w:r>
-              <w:rPr>
-                <w:rFonts w:ascii="Calibri" w:hAnsi="Calibri" w:eastAsia="Calibri"/>
-                <w:b w:val="0"/>
-                <w:sz w:val="20"/>
-              </w:rPr>
-              <w:t>Indic data expansion (Nova API)</w:t>
-            </w:r>
-          </w:p>
-        </w:tc>
-        <w:tc>
-          <w:tcPr>
-            <w:tcW w:type="dxa" w:w="4896"/>
-          </w:tcPr>
-          <w:p>
-            <w:r/>
-            <w:r>
-              <w:rPr>
-                <w:rFonts w:ascii="Calibri" w:hAnsi="Calibri" w:eastAsia="Calibri"/>
-                <w:b w:val="0"/>
-                <w:sz w:val="20"/>
-              </w:rPr>
-              <w:t>~$2–3</w:t>
-            </w:r>
-          </w:p>
-        </w:tc>
-      </w:tr>
-      <w:tr>
-        <w:tc>
-          <w:tcPr>
-            <w:tcW w:type="dxa" w:w="4896"/>
-          </w:tcPr>
-          <w:p>
-            <w:r/>
-            <w:r>
-              <w:rPr>
-                <w:rFonts w:ascii="Calibri" w:hAnsi="Calibri" w:eastAsia="Calibri"/>
-                <w:b w:val="0"/>
-                <w:sz w:val="20"/>
-              </w:rPr>
-              <w:t>Full v1+v2 project incl. debug</w:t>
-            </w:r>
-          </w:p>
-        </w:tc>
-        <w:tc>
-          <w:tcPr>
-            <w:tcW w:type="dxa" w:w="4896"/>
-          </w:tcPr>
-          <w:p>
-            <w:r/>
-            <w:r>
-              <w:rPr>
-                <w:rFonts w:ascii="Calibri" w:hAnsi="Calibri" w:eastAsia="Calibri"/>
-                <w:b w:val="0"/>
-                <w:sz w:val="20"/>
-              </w:rPr>
-              <w:t>~$40–50</w:t>
-            </w:r>
-          </w:p>
-        </w:tc>
-      </w:tr>
-      <w:tr>
-        <w:tc>
-          <w:tcPr>
-            <w:tcW w:type="dxa" w:w="4896"/>
-          </w:tcPr>
-          <w:p>
-            <w:r/>
-            <w:r>
-              <w:rPr>
-                <w:rFonts w:ascii="Calibri" w:hAnsi="Calibri" w:eastAsia="Calibri"/>
-                <w:b w:val="0"/>
-                <w:sz w:val="20"/>
-              </w:rPr>
-              <w:t>Annotation army / user SMS</w:t>
-            </w:r>
-          </w:p>
-        </w:tc>
-        <w:tc>
-          <w:tcPr>
-            <w:tcW w:type="dxa" w:w="4896"/>
-          </w:tcPr>
-          <w:p>
-            <w:r/>
-            <w:r>
-              <w:rPr>
-                <w:rFonts w:ascii="Calibri" w:hAnsi="Calibri" w:eastAsia="Calibri"/>
-                <w:b w:val="0"/>
-                <w:sz w:val="20"/>
-              </w:rPr>
-              <w:t>$0 (not used)</w:t>
-            </w:r>
-          </w:p>
-        </w:tc>
-      </w:tr>
-    </w:tbl>
-    <w:p/>
-    <w:p>
-      <w:pPr>
-        <w:spacing w:after="160" w:before="0"/>
-      </w:pPr>
-      <w:r>
-        <w:rPr>
-          <w:rFonts w:ascii="Calibri" w:hAnsi="Calibri" w:eastAsia="Calibri"/>
-          <w:b w:val="0"/>
-          <w:sz w:val="22"/>
-        </w:rPr>
-        <w:t>Contrast: continuous cloud LLM calls for every SMS across a growing user base would be a recurring OpEx line. On-device inference after download is effectively free per message at the API layer.</w:t>
-      </w:r>
-    </w:p>
-    <w:p>
-      <w:pPr>
-        <w:pStyle w:val="Heading1"/>
-      </w:pPr>
-      <w:r>
-        <w:rPr>
-          <w:color w:val="0F3D3E"/>
-        </w:rPr>
-        <w:t>9. What we open-sourced (and why)</w:t>
+        <w:t>Cost</w:t>
       </w:r>
     </w:p>
     <w:p>
@@ -2786,206 +1889,10 @@
         <w:rPr>
           <w:rFonts w:ascii="Calibri" w:hAnsi="Calibri" w:eastAsia="Calibri"/>
           <w:b w:val="0"/>
+          <w:i w:val="0"/>
           <w:sz w:val="22"/>
         </w:rPr>
-        <w:t>Open-sourcing builds trust, invites bank/locale contributions, and lets researchers reproduce the gates. Because training data is synthetic and the base model is Apache 2.0, redistribution is clean.</w:t>
-      </w:r>
-    </w:p>
-    <w:tbl>
-      <w:tblPr>
-        <w:tblStyle w:val="TableGrid"/>
-        <w:tblW w:type="auto" w:w="0"/>
-        <w:tblLook w:firstColumn="1" w:firstRow="1" w:lastColumn="0" w:lastRow="0" w:noHBand="0" w:noVBand="1" w:val="04A0"/>
-      </w:tblPr>
-      <w:tblGrid>
-        <w:gridCol w:w="4896"/>
-        <w:gridCol w:w="4896"/>
-      </w:tblGrid>
-      <w:tr>
-        <w:tc>
-          <w:tcPr>
-            <w:tcW w:type="dxa" w:w="4896"/>
-            <w:shd w:fill="0F3D3E"/>
-          </w:tcPr>
-          <w:p>
-            <w:r/>
-            <w:r>
-              <w:rPr>
-                <w:rFonts w:ascii="Calibri" w:hAnsi="Calibri" w:eastAsia="Calibri"/>
-                <w:b/>
-                <w:color w:val="FFFFFF"/>
-                <w:sz w:val="20"/>
-              </w:rPr>
-              <w:t>Artifact</w:t>
-            </w:r>
-          </w:p>
-        </w:tc>
-        <w:tc>
-          <w:tcPr>
-            <w:tcW w:type="dxa" w:w="4896"/>
-            <w:shd w:fill="0F3D3E"/>
-          </w:tcPr>
-          <w:p>
-            <w:r/>
-            <w:r>
-              <w:rPr>
-                <w:rFonts w:ascii="Calibri" w:hAnsi="Calibri" w:eastAsia="Calibri"/>
-                <w:b/>
-                <w:color w:val="FFFFFF"/>
-                <w:sz w:val="20"/>
-              </w:rPr>
-              <w:t>URL</w:t>
-            </w:r>
-          </w:p>
-        </w:tc>
-      </w:tr>
-      <w:tr>
-        <w:tc>
-          <w:tcPr>
-            <w:tcW w:type="dxa" w:w="4896"/>
-          </w:tcPr>
-          <w:p>
-            <w:r/>
-            <w:r>
-              <w:rPr>
-                <w:rFonts w:ascii="Calibri" w:hAnsi="Calibri" w:eastAsia="Calibri"/>
-                <w:b w:val="0"/>
-                <w:sz w:val="20"/>
-              </w:rPr>
-              <w:t>Model (bf16 + adapter)</w:t>
-            </w:r>
-          </w:p>
-        </w:tc>
-        <w:tc>
-          <w:tcPr>
-            <w:tcW w:type="dxa" w:w="4896"/>
-          </w:tcPr>
-          <w:p>
-            <w:r/>
-            <w:r>
-              <w:rPr>
-                <w:rFonts w:ascii="Calibri" w:hAnsi="Calibri" w:eastAsia="Calibri"/>
-                <w:b w:val="0"/>
-                <w:sz w:val="20"/>
-              </w:rPr>
-              <w:t>https://huggingface.co/finndot/finnai-slm-v2</w:t>
-            </w:r>
-          </w:p>
-        </w:tc>
-      </w:tr>
-      <w:tr>
-        <w:tc>
-          <w:tcPr>
-            <w:tcW w:type="dxa" w:w="4896"/>
-          </w:tcPr>
-          <w:p>
-            <w:r/>
-            <w:r>
-              <w:rPr>
-                <w:rFonts w:ascii="Calibri" w:hAnsi="Calibri" w:eastAsia="Calibri"/>
-                <w:b w:val="0"/>
-                <w:sz w:val="20"/>
-              </w:rPr>
-              <w:t>Dataset</w:t>
-            </w:r>
-          </w:p>
-        </w:tc>
-        <w:tc>
-          <w:tcPr>
-            <w:tcW w:type="dxa" w:w="4896"/>
-          </w:tcPr>
-          <w:p>
-            <w:r/>
-            <w:r>
-              <w:rPr>
-                <w:rFonts w:ascii="Calibri" w:hAnsi="Calibri" w:eastAsia="Calibri"/>
-                <w:b w:val="0"/>
-                <w:sz w:val="20"/>
-              </w:rPr>
-              <w:t>https://huggingface.co/datasets/finndot/finnai-slm-data</w:t>
-            </w:r>
-          </w:p>
-        </w:tc>
-      </w:tr>
-      <w:tr>
-        <w:tc>
-          <w:tcPr>
-            <w:tcW w:type="dxa" w:w="4896"/>
-          </w:tcPr>
-          <w:p>
-            <w:r/>
-            <w:r>
-              <w:rPr>
-                <w:rFonts w:ascii="Calibri" w:hAnsi="Calibri" w:eastAsia="Calibri"/>
-                <w:b w:val="0"/>
-                <w:sz w:val="20"/>
-              </w:rPr>
-              <w:t>Code + docs toolkit</w:t>
-            </w:r>
-          </w:p>
-        </w:tc>
-        <w:tc>
-          <w:tcPr>
-            <w:tcW w:type="dxa" w:w="4896"/>
-          </w:tcPr>
-          <w:p>
-            <w:r/>
-            <w:r>
-              <w:rPr>
-                <w:rFonts w:ascii="Calibri" w:hAnsi="Calibri" w:eastAsia="Calibri"/>
-                <w:b w:val="0"/>
-                <w:sz w:val="20"/>
-              </w:rPr>
-              <w:t>https://github.com/arunbhatg/finnai-slm</w:t>
-            </w:r>
-          </w:p>
-        </w:tc>
-      </w:tr>
-      <w:tr>
-        <w:tc>
-          <w:tcPr>
-            <w:tcW w:type="dxa" w:w="4896"/>
-          </w:tcPr>
-          <w:p>
-            <w:r/>
-            <w:r>
-              <w:rPr>
-                <w:rFonts w:ascii="Calibri" w:hAnsi="Calibri" w:eastAsia="Calibri"/>
-                <w:b w:val="0"/>
-                <w:sz w:val="20"/>
-              </w:rPr>
-              <w:t>Product app</w:t>
-            </w:r>
-          </w:p>
-        </w:tc>
-        <w:tc>
-          <w:tcPr>
-            <w:tcW w:type="dxa" w:w="4896"/>
-          </w:tcPr>
-          <w:p>
-            <w:r/>
-            <w:r>
-              <w:rPr>
-                <w:rFonts w:ascii="Calibri" w:hAnsi="Calibri" w:eastAsia="Calibri"/>
-                <w:b w:val="0"/>
-                <w:sz w:val="20"/>
-              </w:rPr>
-              <w:t>https://github.com/devaka207/Finndot</w:t>
-            </w:r>
-          </w:p>
-        </w:tc>
-      </w:tr>
-    </w:tbl>
-    <w:p/>
-    <w:p>
-      <w:pPr>
-        <w:pStyle w:val="Heading1"/>
-      </w:pPr>
-      <w:r>
-        <w:rPr>
-          <w:color w:val="0F3D3E"/>
-        </w:rPr>
-        <w:t>10. Limitations &amp; residual risks</w:t>
+        <w:t>One training run is a few hours on a single GPU — low double-digit dollars for the whole v1→v2 loop including eval and Indic data generation. No annotation vendor. No user inbox dump.</w:t>
       </w:r>
     </w:p>
     <w:p>
@@ -2996,17 +1903,10 @@
         <w:rPr>
           <w:rFonts w:ascii="Calibri" w:hAnsi="Calibri" w:eastAsia="Calibri"/>
           <w:b w:val="0"/>
+          <w:i w:val="0"/>
           <w:sz w:val="22"/>
         </w:rPr>
-        <w:t>• Optimized for Indian banking SMS — not a general global SMS model.</w:t>
-        <w:br/>
-        <w:t>• Merchant strings remain the hardest field; regex still wins on supported banks.</w:t>
-        <w:br/>
-        <w:t>• Chat groundedness at 68% is good vs base but not perfect — coaching can still paraphrase figures.</w:t>
-        <w:br/>
-        <w:t>• On-device gate (TTFT / memory on mid-range phones) must be measured on hardware before calling INT4 “fully shipped”.</w:t>
-        <w:br/>
-        <w:t>• Templates cannot cover every NPCI variant overnight; monitoring unrecognized SMS still matters.</w:t>
+        <w:t>Ongoing: downloading the model once is cheaper than paying per SMS to a cloud API forever.</w:t>
       </w:r>
     </w:p>
     <w:p>
@@ -3015,9 +1915,9 @@
       </w:pPr>
       <w:r>
         <w:rPr>
-          <w:color w:val="0F3D3E"/>
+          <w:color w:val="1A1A1A"/>
         </w:rPr>
-        <w:t>11. What good looks like next</w:t>
+        <w:t>What we published</w:t>
       </w:r>
     </w:p>
     <w:p>
@@ -3028,15 +1928,10 @@
         <w:rPr>
           <w:rFonts w:ascii="Calibri" w:hAnsi="Calibri" w:eastAsia="Calibri"/>
           <w:b w:val="0"/>
+          <w:i w:val="0"/>
           <w:sz w:val="22"/>
         </w:rPr>
-        <w:t>1. Complete on-device INT4 bench and point the app MODEL_URL at CloudFront when gate 5 passes.</w:t>
-        <w:br/>
-        <w:t>2. Keep expanding Indic + long-tail banks via synthetic templates (not user dumps).</w:t>
-        <w:br/>
-        <w:t>3. Invite community PRs on the public toolkit for new locales.</w:t>
-        <w:br/>
-        <w:t>4. Reuse the same playbook for adjacent on-device extraction jobs (receipts, invoices) where privacy matters.</w:t>
+        <w:t>Weights, dataset, training/eval code, and this write-up are public (Apache 2.0). Links are on the cover. Others can fine-tune further or copy the approach for other private on-device jobs.</w:t>
       </w:r>
     </w:p>
     <w:p>
@@ -3045,342 +1940,9 @@
       </w:pPr>
       <w:r>
         <w:rPr>
-          <w:color w:val="0F3D3E"/>
+          <w:color w:val="1A1A1A"/>
         </w:rPr>
-        <w:t>Appendix A — Glossary</w:t>
-      </w:r>
-    </w:p>
-    <w:tbl>
-      <w:tblPr>
-        <w:tblStyle w:val="TableGrid"/>
-        <w:tblW w:type="auto" w:w="0"/>
-        <w:tblLook w:firstColumn="1" w:firstRow="1" w:lastColumn="0" w:lastRow="0" w:noHBand="0" w:noVBand="1" w:val="04A0"/>
-      </w:tblPr>
-      <w:tblGrid>
-        <w:gridCol w:w="4896"/>
-        <w:gridCol w:w="4896"/>
-      </w:tblGrid>
-      <w:tr>
-        <w:tc>
-          <w:tcPr>
-            <w:tcW w:type="dxa" w:w="4896"/>
-            <w:shd w:fill="0F3D3E"/>
-          </w:tcPr>
-          <w:p>
-            <w:r/>
-            <w:r>
-              <w:rPr>
-                <w:rFonts w:ascii="Calibri" w:hAnsi="Calibri" w:eastAsia="Calibri"/>
-                <w:b/>
-                <w:color w:val="FFFFFF"/>
-                <w:sz w:val="20"/>
-              </w:rPr>
-              <w:t>Term</w:t>
-            </w:r>
-          </w:p>
-        </w:tc>
-        <w:tc>
-          <w:tcPr>
-            <w:tcW w:type="dxa" w:w="4896"/>
-            <w:shd w:fill="0F3D3E"/>
-          </w:tcPr>
-          <w:p>
-            <w:r/>
-            <w:r>
-              <w:rPr>
-                <w:rFonts w:ascii="Calibri" w:hAnsi="Calibri" w:eastAsia="Calibri"/>
-                <w:b/>
-                <w:color w:val="FFFFFF"/>
-                <w:sz w:val="20"/>
-              </w:rPr>
-              <w:t>Plain meaning</w:t>
-            </w:r>
-          </w:p>
-        </w:tc>
-      </w:tr>
-      <w:tr>
-        <w:tc>
-          <w:tcPr>
-            <w:tcW w:type="dxa" w:w="4896"/>
-          </w:tcPr>
-          <w:p>
-            <w:r/>
-            <w:r>
-              <w:rPr>
-                <w:rFonts w:ascii="Calibri" w:hAnsi="Calibri" w:eastAsia="Calibri"/>
-                <w:b w:val="0"/>
-                <w:sz w:val="20"/>
-              </w:rPr>
-              <w:t>LLM</w:t>
-            </w:r>
-          </w:p>
-        </w:tc>
-        <w:tc>
-          <w:tcPr>
-            <w:tcW w:type="dxa" w:w="4896"/>
-          </w:tcPr>
-          <w:p>
-            <w:r/>
-            <w:r>
-              <w:rPr>
-                <w:rFonts w:ascii="Calibri" w:hAnsi="Calibri" w:eastAsia="Calibri"/>
-                <w:b w:val="0"/>
-                <w:sz w:val="20"/>
-              </w:rPr>
-              <w:t>Large Language Model — software that predicts text (ChatGPT-class systems)</w:t>
-            </w:r>
-          </w:p>
-        </w:tc>
-      </w:tr>
-      <w:tr>
-        <w:tc>
-          <w:tcPr>
-            <w:tcW w:type="dxa" w:w="4896"/>
-          </w:tcPr>
-          <w:p>
-            <w:r/>
-            <w:r>
-              <w:rPr>
-                <w:rFonts w:ascii="Calibri" w:hAnsi="Calibri" w:eastAsia="Calibri"/>
-                <w:b w:val="0"/>
-                <w:sz w:val="20"/>
-              </w:rPr>
-              <w:t>SLM</w:t>
-            </w:r>
-          </w:p>
-        </w:tc>
-        <w:tc>
-          <w:tcPr>
-            <w:tcW w:type="dxa" w:w="4896"/>
-          </w:tcPr>
-          <w:p>
-            <w:r/>
-            <w:r>
-              <w:rPr>
-                <w:rFonts w:ascii="Calibri" w:hAnsi="Calibri" w:eastAsia="Calibri"/>
-                <w:b w:val="0"/>
-                <w:sz w:val="20"/>
-              </w:rPr>
-              <w:t>Small Language Model — same idea, small enough for a phone</w:t>
-            </w:r>
-          </w:p>
-        </w:tc>
-      </w:tr>
-      <w:tr>
-        <w:tc>
-          <w:tcPr>
-            <w:tcW w:type="dxa" w:w="4896"/>
-          </w:tcPr>
-          <w:p>
-            <w:r/>
-            <w:r>
-              <w:rPr>
-                <w:rFonts w:ascii="Calibri" w:hAnsi="Calibri" w:eastAsia="Calibri"/>
-                <w:b w:val="0"/>
-                <w:sz w:val="20"/>
-              </w:rPr>
-              <w:t>Fine-tuning</w:t>
-            </w:r>
-          </w:p>
-        </w:tc>
-        <w:tc>
-          <w:tcPr>
-            <w:tcW w:type="dxa" w:w="4896"/>
-          </w:tcPr>
-          <w:p>
-            <w:r/>
-            <w:r>
-              <w:rPr>
-                <w:rFonts w:ascii="Calibri" w:hAnsi="Calibri" w:eastAsia="Calibri"/>
-                <w:b w:val="0"/>
-                <w:sz w:val="20"/>
-              </w:rPr>
-              <w:t>Extra training so a base model specializes for your task</w:t>
-            </w:r>
-          </w:p>
-        </w:tc>
-      </w:tr>
-      <w:tr>
-        <w:tc>
-          <w:tcPr>
-            <w:tcW w:type="dxa" w:w="4896"/>
-          </w:tcPr>
-          <w:p>
-            <w:r/>
-            <w:r>
-              <w:rPr>
-                <w:rFonts w:ascii="Calibri" w:hAnsi="Calibri" w:eastAsia="Calibri"/>
-                <w:b w:val="0"/>
-                <w:sz w:val="20"/>
-              </w:rPr>
-              <w:t>QLoRA</w:t>
-            </w:r>
-          </w:p>
-        </w:tc>
-        <w:tc>
-          <w:tcPr>
-            <w:tcW w:type="dxa" w:w="4896"/>
-          </w:tcPr>
-          <w:p>
-            <w:r/>
-            <w:r>
-              <w:rPr>
-                <w:rFonts w:ascii="Calibri" w:hAnsi="Calibri" w:eastAsia="Calibri"/>
-                <w:b w:val="0"/>
-                <w:sz w:val="20"/>
-              </w:rPr>
-              <w:t>Efficient fine-tuning: freeze big model, train tiny adapter in 4-bit</w:t>
-            </w:r>
-          </w:p>
-        </w:tc>
-      </w:tr>
-      <w:tr>
-        <w:tc>
-          <w:tcPr>
-            <w:tcW w:type="dxa" w:w="4896"/>
-          </w:tcPr>
-          <w:p>
-            <w:r/>
-            <w:r>
-              <w:rPr>
-                <w:rFonts w:ascii="Calibri" w:hAnsi="Calibri" w:eastAsia="Calibri"/>
-                <w:b w:val="0"/>
-                <w:sz w:val="20"/>
-              </w:rPr>
-              <w:t>SFT</w:t>
-            </w:r>
-          </w:p>
-        </w:tc>
-        <w:tc>
-          <w:tcPr>
-            <w:tcW w:type="dxa" w:w="4896"/>
-          </w:tcPr>
-          <w:p>
-            <w:r/>
-            <w:r>
-              <w:rPr>
-                <w:rFonts w:ascii="Calibri" w:hAnsi="Calibri" w:eastAsia="Calibri"/>
-                <w:b w:val="0"/>
-                <w:sz w:val="20"/>
-              </w:rPr>
-              <w:t>Supervised Fine-Tuning — learn from input→correct output pairs</w:t>
-            </w:r>
-          </w:p>
-        </w:tc>
-      </w:tr>
-      <w:tr>
-        <w:tc>
-          <w:tcPr>
-            <w:tcW w:type="dxa" w:w="4896"/>
-          </w:tcPr>
-          <w:p>
-            <w:r/>
-            <w:r>
-              <w:rPr>
-                <w:rFonts w:ascii="Calibri" w:hAnsi="Calibri" w:eastAsia="Calibri"/>
-                <w:b w:val="0"/>
-                <w:sz w:val="20"/>
-              </w:rPr>
-              <w:t>R-EM</w:t>
-            </w:r>
-          </w:p>
-        </w:tc>
-        <w:tc>
-          <w:tcPr>
-            <w:tcW w:type="dxa" w:w="4896"/>
-          </w:tcPr>
-          <w:p>
-            <w:r/>
-            <w:r>
-              <w:rPr>
-                <w:rFonts w:ascii="Calibri" w:hAnsi="Calibri" w:eastAsia="Calibri"/>
-                <w:b w:val="0"/>
-                <w:sz w:val="20"/>
-              </w:rPr>
-              <w:t>Strict Record Exact-Match — all key SMS fields correct</w:t>
-            </w:r>
-          </w:p>
-        </w:tc>
-      </w:tr>
-      <w:tr>
-        <w:tc>
-          <w:tcPr>
-            <w:tcW w:type="dxa" w:w="4896"/>
-          </w:tcPr>
-          <w:p>
-            <w:r/>
-            <w:r>
-              <w:rPr>
-                <w:rFonts w:ascii="Calibri" w:hAnsi="Calibri" w:eastAsia="Calibri"/>
-                <w:b w:val="0"/>
-                <w:sz w:val="20"/>
-              </w:rPr>
-              <w:t>Groundedness</w:t>
-            </w:r>
-          </w:p>
-        </w:tc>
-        <w:tc>
-          <w:tcPr>
-            <w:tcW w:type="dxa" w:w="4896"/>
-          </w:tcPr>
-          <w:p>
-            <w:r/>
-            <w:r>
-              <w:rPr>
-                <w:rFonts w:ascii="Calibri" w:hAnsi="Calibri" w:eastAsia="Calibri"/>
-                <w:b w:val="0"/>
-                <w:sz w:val="20"/>
-              </w:rPr>
-              <w:t>Every number in the answer appears in the provided ledger</w:t>
-            </w:r>
-          </w:p>
-        </w:tc>
-      </w:tr>
-      <w:tr>
-        <w:tc>
-          <w:tcPr>
-            <w:tcW w:type="dxa" w:w="4896"/>
-          </w:tcPr>
-          <w:p>
-            <w:r/>
-            <w:r>
-              <w:rPr>
-                <w:rFonts w:ascii="Calibri" w:hAnsi="Calibri" w:eastAsia="Calibri"/>
-                <w:b w:val="0"/>
-                <w:sz w:val="20"/>
-              </w:rPr>
-              <w:t>INT4 / LiteRT-LM</w:t>
-            </w:r>
-          </w:p>
-        </w:tc>
-        <w:tc>
-          <w:tcPr>
-            <w:tcW w:type="dxa" w:w="4896"/>
-          </w:tcPr>
-          <w:p>
-            <w:r/>
-            <w:r>
-              <w:rPr>
-                <w:rFonts w:ascii="Calibri" w:hAnsi="Calibri" w:eastAsia="Calibri"/>
-                <w:b w:val="0"/>
-                <w:sz w:val="20"/>
-              </w:rPr>
-              <w:t>Compressed on-device format used by the Android runtime</w:t>
-            </w:r>
-          </w:p>
-        </w:tc>
-      </w:tr>
-    </w:tbl>
-    <w:p/>
-    <w:p>
-      <w:pPr>
-        <w:pStyle w:val="Heading1"/>
-      </w:pPr>
-      <w:r>
-        <w:rPr>
-          <w:color w:val="0F3D3E"/>
-        </w:rPr>
-        <w:t>Appendix B — Technical hyperparameter snapshot</w:t>
+        <w:t>Honest limits</w:t>
       </w:r>
     </w:p>
     <w:p>
@@ -3391,14 +1953,319 @@
         <w:rPr>
           <w:rFonts w:ascii="Calibri" w:hAnsi="Calibri" w:eastAsia="Calibri"/>
           <w:b w:val="0"/>
-          <w:sz w:val="20"/>
+          <w:i w:val="0"/>
+          <w:sz w:val="22"/>
         </w:rPr>
-        <w:t>Base Qwen/Qwen3-1.7B; QLoRA NF4 double-quant bf16 compute; LoRA r=16 α=32 dropout 0.05; targets q/k/v/o/gate/up/down_proj; 3 epochs; lr 2e-4 cosine 3% warmup; batch 2× accum 8; max len 1536; packing off; seed 42; greedy decode at eval; thinking off.</w:t>
+        <w:t>Built for Indian bank SMS. Regex still wins on banks we fully support. Merchant names are the fiddliest field. Coach answers can still paraphrase numbers sometimes. We still need a real-device speed/memory check before calling the phone build fully done.</w:t>
       </w:r>
     </w:p>
+    <w:p>
+      <w:pPr>
+        <w:pStyle w:val="Heading1"/>
+      </w:pPr>
+      <w:r>
+        <w:rPr>
+          <w:color w:val="1A1A1A"/>
+        </w:rPr>
+        <w:t>Next</w:t>
+      </w:r>
+    </w:p>
+    <w:p>
+      <w:pPr>
+        <w:spacing w:after="160" w:before="0"/>
+      </w:pPr>
+      <w:r>
+        <w:rPr>
+          <w:rFonts w:ascii="Calibri" w:hAnsi="Calibri" w:eastAsia="Calibri"/>
+          <w:b w:val="0"/>
+          <w:i w:val="0"/>
+          <w:sz w:val="22"/>
+        </w:rPr>
+        <w:t>Finish on-device timing, point the app at the new file when that passes, keep growing templates for new banks and languages — still without training on user SMS.</w:t>
+      </w:r>
+    </w:p>
+    <w:p>
+      <w:pPr>
+        <w:pStyle w:val="Heading1"/>
+      </w:pPr>
+      <w:r>
+        <w:rPr>
+          <w:color w:val="1A1A1A"/>
+        </w:rPr>
+        <w:t>Glossary</w:t>
+      </w:r>
+    </w:p>
+    <w:tbl>
+      <w:tblPr>
+        <w:tblStyle w:val="TableGrid"/>
+        <w:tblW w:type="auto" w:w="0"/>
+        <w:tblLook w:firstColumn="1" w:firstRow="1" w:lastColumn="0" w:lastRow="0" w:noHBand="0" w:noVBand="1" w:val="04A0"/>
+      </w:tblPr>
+      <w:tblGrid>
+        <w:gridCol w:w="4824"/>
+        <w:gridCol w:w="4824"/>
+      </w:tblGrid>
+      <w:tr>
+        <w:tc>
+          <w:tcPr>
+            <w:tcW w:type="dxa" w:w="4824"/>
+            <w:shd w:fill="1A1A1A"/>
+          </w:tcPr>
+          <w:p>
+            <w:r/>
+            <w:r>
+              <w:rPr>
+                <w:rFonts w:ascii="Calibri" w:hAnsi="Calibri" w:eastAsia="Calibri"/>
+                <w:b/>
+                <w:i w:val="0"/>
+                <w:color w:val="FFFFFF"/>
+                <w:sz w:val="20"/>
+              </w:rPr>
+              <w:t>Term</w:t>
+            </w:r>
+          </w:p>
+        </w:tc>
+        <w:tc>
+          <w:tcPr>
+            <w:tcW w:type="dxa" w:w="4824"/>
+            <w:shd w:fill="1A1A1A"/>
+          </w:tcPr>
+          <w:p>
+            <w:r/>
+            <w:r>
+              <w:rPr>
+                <w:rFonts w:ascii="Calibri" w:hAnsi="Calibri" w:eastAsia="Calibri"/>
+                <w:b/>
+                <w:i w:val="0"/>
+                <w:color w:val="FFFFFF"/>
+                <w:sz w:val="20"/>
+              </w:rPr>
+              <w:t>Meaning</w:t>
+            </w:r>
+          </w:p>
+        </w:tc>
+      </w:tr>
+      <w:tr>
+        <w:tc>
+          <w:tcPr>
+            <w:tcW w:type="dxa" w:w="4824"/>
+          </w:tcPr>
+          <w:p>
+            <w:r/>
+            <w:r>
+              <w:rPr>
+                <w:rFonts w:ascii="Calibri" w:hAnsi="Calibri" w:eastAsia="Calibri"/>
+                <w:b w:val="0"/>
+                <w:i w:val="0"/>
+                <w:sz w:val="20"/>
+              </w:rPr>
+              <w:t>LLM / SLM</w:t>
+            </w:r>
+          </w:p>
+        </w:tc>
+        <w:tc>
+          <w:tcPr>
+            <w:tcW w:type="dxa" w:w="4824"/>
+          </w:tcPr>
+          <w:p>
+            <w:r/>
+            <w:r>
+              <w:rPr>
+                <w:rFonts w:ascii="Calibri" w:hAnsi="Calibri" w:eastAsia="Calibri"/>
+                <w:b w:val="0"/>
+                <w:i w:val="0"/>
+                <w:sz w:val="20"/>
+              </w:rPr>
+              <w:t>Large / small language model</w:t>
+            </w:r>
+          </w:p>
+        </w:tc>
+      </w:tr>
+      <w:tr>
+        <w:tc>
+          <w:tcPr>
+            <w:tcW w:type="dxa" w:w="4824"/>
+          </w:tcPr>
+          <w:p>
+            <w:r/>
+            <w:r>
+              <w:rPr>
+                <w:rFonts w:ascii="Calibri" w:hAnsi="Calibri" w:eastAsia="Calibri"/>
+                <w:b w:val="0"/>
+                <w:i w:val="0"/>
+                <w:sz w:val="20"/>
+              </w:rPr>
+              <w:t>Fine-tune</w:t>
+            </w:r>
+          </w:p>
+        </w:tc>
+        <w:tc>
+          <w:tcPr>
+            <w:tcW w:type="dxa" w:w="4824"/>
+          </w:tcPr>
+          <w:p>
+            <w:r/>
+            <w:r>
+              <w:rPr>
+                <w:rFonts w:ascii="Calibri" w:hAnsi="Calibri" w:eastAsia="Calibri"/>
+                <w:b w:val="0"/>
+                <w:i w:val="0"/>
+                <w:sz w:val="20"/>
+              </w:rPr>
+              <w:t>Extra training for one job</w:t>
+            </w:r>
+          </w:p>
+        </w:tc>
+      </w:tr>
+      <w:tr>
+        <w:tc>
+          <w:tcPr>
+            <w:tcW w:type="dxa" w:w="4824"/>
+          </w:tcPr>
+          <w:p>
+            <w:r/>
+            <w:r>
+              <w:rPr>
+                <w:rFonts w:ascii="Calibri" w:hAnsi="Calibri" w:eastAsia="Calibri"/>
+                <w:b w:val="0"/>
+                <w:i w:val="0"/>
+                <w:sz w:val="20"/>
+              </w:rPr>
+              <w:t>QLoRA</w:t>
+            </w:r>
+          </w:p>
+        </w:tc>
+        <w:tc>
+          <w:tcPr>
+            <w:tcW w:type="dxa" w:w="4824"/>
+          </w:tcPr>
+          <w:p>
+            <w:r/>
+            <w:r>
+              <w:rPr>
+                <w:rFonts w:ascii="Calibri" w:hAnsi="Calibri" w:eastAsia="Calibri"/>
+                <w:b w:val="0"/>
+                <w:i w:val="0"/>
+                <w:sz w:val="20"/>
+              </w:rPr>
+              <w:t>Train a small adapter; keep the base frozen</w:t>
+            </w:r>
+          </w:p>
+        </w:tc>
+      </w:tr>
+      <w:tr>
+        <w:tc>
+          <w:tcPr>
+            <w:tcW w:type="dxa" w:w="4824"/>
+          </w:tcPr>
+          <w:p>
+            <w:r/>
+            <w:r>
+              <w:rPr>
+                <w:rFonts w:ascii="Calibri" w:hAnsi="Calibri" w:eastAsia="Calibri"/>
+                <w:b w:val="0"/>
+                <w:i w:val="0"/>
+                <w:sz w:val="20"/>
+              </w:rPr>
+              <w:t>SFT</w:t>
+            </w:r>
+          </w:p>
+        </w:tc>
+        <w:tc>
+          <w:tcPr>
+            <w:tcW w:type="dxa" w:w="4824"/>
+          </w:tcPr>
+          <w:p>
+            <w:r/>
+            <w:r>
+              <w:rPr>
+                <w:rFonts w:ascii="Calibri" w:hAnsi="Calibri" w:eastAsia="Calibri"/>
+                <w:b w:val="0"/>
+                <w:i w:val="0"/>
+                <w:sz w:val="20"/>
+              </w:rPr>
+              <w:t>Learn from input → correct output pairs</w:t>
+            </w:r>
+          </w:p>
+        </w:tc>
+      </w:tr>
+      <w:tr>
+        <w:tc>
+          <w:tcPr>
+            <w:tcW w:type="dxa" w:w="4824"/>
+          </w:tcPr>
+          <w:p>
+            <w:r/>
+            <w:r>
+              <w:rPr>
+                <w:rFonts w:ascii="Calibri" w:hAnsi="Calibri" w:eastAsia="Calibri"/>
+                <w:b w:val="0"/>
+                <w:i w:val="0"/>
+                <w:sz w:val="20"/>
+              </w:rPr>
+              <w:t>R-EM</w:t>
+            </w:r>
+          </w:p>
+        </w:tc>
+        <w:tc>
+          <w:tcPr>
+            <w:tcW w:type="dxa" w:w="4824"/>
+          </w:tcPr>
+          <w:p>
+            <w:r/>
+            <w:r>
+              <w:rPr>
+                <w:rFonts w:ascii="Calibri" w:hAnsi="Calibri" w:eastAsia="Calibri"/>
+                <w:b w:val="0"/>
+                <w:i w:val="0"/>
+                <w:sz w:val="20"/>
+              </w:rPr>
+              <w:t>All key SMS fields match gold</w:t>
+            </w:r>
+          </w:p>
+        </w:tc>
+      </w:tr>
+      <w:tr>
+        <w:tc>
+          <w:tcPr>
+            <w:tcW w:type="dxa" w:w="4824"/>
+          </w:tcPr>
+          <w:p>
+            <w:r/>
+            <w:r>
+              <w:rPr>
+                <w:rFonts w:ascii="Calibri" w:hAnsi="Calibri" w:eastAsia="Calibri"/>
+                <w:b w:val="0"/>
+                <w:i w:val="0"/>
+                <w:sz w:val="20"/>
+              </w:rPr>
+              <w:t>Grounded</w:t>
+            </w:r>
+          </w:p>
+        </w:tc>
+        <w:tc>
+          <w:tcPr>
+            <w:tcW w:type="dxa" w:w="4824"/>
+          </w:tcPr>
+          <w:p>
+            <w:r/>
+            <w:r>
+              <w:rPr>
+                <w:rFonts w:ascii="Calibri" w:hAnsi="Calibri" w:eastAsia="Calibri"/>
+                <w:b w:val="0"/>
+                <w:i w:val="0"/>
+                <w:sz w:val="20"/>
+              </w:rPr>
+              <w:t>Numbers in the answer exist in the ledger prompt</w:t>
+            </w:r>
+          </w:p>
+        </w:tc>
+      </w:tr>
+    </w:tbl>
+    <w:p/>
     <w:sectPr>
       <w:pgSz w:w="12240" w:h="15840"/>
-      <w:pgMar w:top="1080" w:right="1224" w:bottom="1080" w:left="1224" w:header="720" w:footer="720" w:gutter="0"/>
+      <w:pgMar w:top="1152" w:right="1296" w:bottom="1152" w:left="1296" w:header="720" w:footer="720" w:gutter="0"/>
       <w:cols w:space="720"/>
       <w:docGrid w:linePitch="360"/>
     </w:sectPr>

</xml_diff>